<commit_message>
Add ESPR product fields, QR management (US6.6–6.14), app-managed auth
- App-managed username/password auth (session cookie) replacing XSUAA:
  custom CAP auth, /auth/login|logout|change-password, user-management
  actions, bcrypt credentials.
- ESPR product data: durability_score, repairability_score (0–10),
  reuse_instructions, care/repair/disposal/reuse video links, per-variant
  image_data (base64); surfaced in the public consumer DTO.
- QR/public access (US6.6–6.14): token-based public_url, item-level
  identification in the consumer DTO (product/batch/serial/UPI/DPP id),
  regenerate keeps the DPP while invalidating the old token.
- Seed: ESPR demo values, token-based public_url, removed obsolete
  kaa_learn BTP bootstrap users.
- Tests: qr-access, auth-routes/user-onboarding, password/session units.

Co-Authored-By: Claude Opus 4.8 (1M context) <noreply@anthropic.com>
</commit_message>
<xml_diff>
--- a/docs/Tech-Stack-und-Architektur-Details.docx
+++ b/docs/Tech-Stack-und-Architektur-Details.docx
@@ -2,7 +2,7 @@
 <file path=word/document.xml><?xml version="1.0" encoding="utf-8"?>
 <w:document xmlns:w="http://schemas.openxmlformats.org/wordprocessingml/2006/main" xmlns:m="http://schemas.openxmlformats.org/officeDocument/2006/math" xmlns:r="http://schemas.openxmlformats.org/officeDocument/2006/relationships" xmlns:o="urn:schemas-microsoft-com:office:office" xmlns:v="urn:schemas-microsoft-com:vml" xmlns:w10="urn:schemas-microsoft-com:office:word" xmlns:a="http://schemas.openxmlformats.org/drawingml/2006/main" xmlns:pic="http://schemas.openxmlformats.org/drawingml/2006/picture" xmlns:wp="http://schemas.openxmlformats.org/drawingml/2006/wordprocessingDrawing">
   <w:body>
-    <w:bookmarkStart w:id="44" w:name="X6e1ce2ad761591200a0334c7713d26303ea801b"/>
+    <w:bookmarkStart w:id="47" w:name="Xe6377aa71ef0512d10ad2e1aa5012c4d8c8ca44"/>
     <w:p>
       <w:pPr>
         <w:pStyle w:val="Heading1"/>
@@ -78,7 +78,7 @@
           <w:iCs/>
           <w:i/>
         </w:rPr>
-        <w:t xml:space="preserve">generiert vs. selbst geschrieben</w:t>
+        <w:t xml:space="preserve">generiert vs. selbst geschrieben</w:t>
       </w:r>
       <w:r>
         <w:t xml:space="preserve"> </w:t>
@@ -94,7 +94,7 @@
           <w:iCs/>
           <w:i/>
         </w:rPr>
-        <w:t xml:space="preserve">Modul vs. Resource</w:t>
+        <w:t xml:space="preserve">Modul vs. Resource</w:t>
       </w:r>
       <w:r>
         <w:t xml:space="preserve">.</w:t>
@@ -111,15 +111,15 @@
         </w:rPr>
         <w:t xml:space="preserve">Die drei Sichten in je einem Satz:</w:t>
       </w:r>
-      <w:r>
-        <w:t xml:space="preserve"> </w:t>
-      </w:r>
-      <w:r>
-        <w:t xml:space="preserve">-</w:t>
-      </w:r>
-      <w:r>
-        <w:t xml:space="preserve"> </w:t>
-      </w:r>
+    </w:p>
+    <w:p>
+      <w:pPr>
+        <w:numPr>
+          <w:ilvl w:val="0"/>
+          <w:numId w:val="1001"/>
+        </w:numPr>
+        <w:pStyle w:val="Compact"/>
+      </w:pPr>
       <w:r>
         <w:rPr>
           <w:bCs/>
@@ -149,15 +149,15 @@
       <w:r>
         <w:t xml:space="preserve">gebaut wird.</w:t>
       </w:r>
-      <w:r>
-        <w:t xml:space="preserve"> </w:t>
-      </w:r>
-      <w:r>
-        <w:t xml:space="preserve">-</w:t>
-      </w:r>
-      <w:r>
-        <w:t xml:space="preserve"> </w:t>
-      </w:r>
+    </w:p>
+    <w:p>
+      <w:pPr>
+        <w:numPr>
+          <w:ilvl w:val="0"/>
+          <w:numId w:val="1001"/>
+        </w:numPr>
+        <w:pStyle w:val="Compact"/>
+      </w:pPr>
       <w:r>
         <w:rPr>
           <w:bCs/>
@@ -187,15 +187,15 @@
       <w:r>
         <w:t xml:space="preserve">der Code aufgebaut ist (logisch, deployment-agnostisch).</w:t>
       </w:r>
-      <w:r>
-        <w:t xml:space="preserve"> </w:t>
-      </w:r>
-      <w:r>
-        <w:t xml:space="preserve">-</w:t>
-      </w:r>
-      <w:r>
-        <w:t xml:space="preserve"> </w:t>
-      </w:r>
+    </w:p>
+    <w:p>
+      <w:pPr>
+        <w:numPr>
+          <w:ilvl w:val="0"/>
+          <w:numId w:val="1001"/>
+        </w:numPr>
+        <w:pStyle w:val="Compact"/>
+      </w:pPr>
       <w:r>
         <w:rPr>
           <w:bCs/>
@@ -303,7 +303,7 @@
         </w:pict>
       </w:r>
     </w:p>
-    <w:bookmarkStart w:id="28" w:name="tech-stack"/>
+    <w:bookmarkStart w:id="28" w:name="X5c3ea11152c5aac224a49002ff05d2475e4aa2c"/>
     <w:p>
       <w:pPr>
         <w:pStyle w:val="Heading2"/>
@@ -324,16 +324,10 @@
     <w:tbl>
       <w:tblPr>
         <w:tblStyle w:val="Table"/>
-        <w:tblW w:type="pct" w:w="5000.0"/>
+        <w:tblW w:type="pct" w:w="0.0"/>
         <w:tblLook w:firstRow="1" w:lastRow="0" w:firstColumn="0" w:lastColumn="0" w:noHBand="0" w:noVBand="0" w:val="0020"/>
       </w:tblPr>
-      <w:tblGrid>
-        <w:gridCol w:w="1584"/>
-        <w:gridCol w:w="1584"/>
-        <w:gridCol w:w="1584"/>
-        <w:gridCol w:w="1584"/>
-        <w:gridCol w:w="1584"/>
-      </w:tblGrid>
+      <w:tblGrid/>
       <w:tr>
         <w:tc>
           <w:p>
@@ -637,7 +631,28 @@
               <w:jc w:val="left"/>
             </w:pPr>
             <w:r>
-              <w:t xml:space="preserve">trägt unter CAP die Public-REST-Routen</w:t>
+              <w:t xml:space="preserve">trägt unter CAP die Public-REST-Routen (</w:t>
+            </w:r>
+            <w:r>
+              <w:rPr>
+                <w:rStyle w:val="VerbatimChar"/>
+              </w:rPr>
+              <w:t xml:space="preserve">/public/dpp/:token</w:t>
+            </w:r>
+            <w:r>
+              <w:t xml:space="preserve">,</w:t>
+            </w:r>
+            <w:r>
+              <w:t xml:space="preserve"> </w:t>
+            </w:r>
+            <w:r>
+              <w:rPr>
+                <w:rStyle w:val="VerbatimChar"/>
+              </w:rPr>
+              <w:t xml:space="preserve">/healthz</w:t>
+            </w:r>
+            <w:r>
+              <w:t xml:space="preserve">)</w:t>
             </w:r>
           </w:p>
         </w:tc>
@@ -702,7 +717,7 @@
               <w:jc w:val="left"/>
             </w:pPr>
             <w:r>
-              <w:t xml:space="preserve">definiert die 12 Entitäten + den Service-Vertrag</w:t>
+              <w:t xml:space="preserve">definiert die 13 Entitäten + den Service-Vertrag</w:t>
             </w:r>
           </w:p>
         </w:tc>
@@ -1405,14 +1420,10 @@
     <w:tbl>
       <w:tblPr>
         <w:tblStyle w:val="Table"/>
-        <w:tblW w:type="pct" w:w="5000.0"/>
+        <w:tblW w:type="pct" w:w="0.0"/>
         <w:tblLook w:firstRow="1" w:lastRow="0" w:firstColumn="0" w:lastColumn="0" w:noHBand="0" w:noVBand="0" w:val="0020"/>
       </w:tblPr>
-      <w:tblGrid>
-        <w:gridCol w:w="2640"/>
-        <w:gridCol w:w="2640"/>
-        <w:gridCol w:w="2640"/>
-      </w:tblGrid>
+      <w:tblGrid/>
       <w:tr>
         <w:tc>
           <w:p>
@@ -1633,7 +1644,7 @@
               <w:jc w:val="left"/>
             </w:pPr>
             <w:r>
-              <w:t xml:space="preserve">bündelt den Code; lokal mit Proxy zum Backend</w:t>
+              <w:t xml:space="preserve">bündelt den Code (3 Entry-Points: App, Consumer-View, Token-Lookup); lokal mit Proxy zum Backend</w:t>
             </w:r>
           </w:p>
         </w:tc>
@@ -1837,13 +1848,24 @@
                 <w:bCs/>
                 <w:b/>
               </w:rPr>
-              <w:t xml:space="preserve">Approuter</w:t>
+              <w:t xml:space="preserve">Application Router</w:t>
             </w:r>
             <w:r>
               <w:t xml:space="preserve"> </w:t>
             </w:r>
             <w:r>
-              <w:t xml:space="preserve">+</w:t>
+              <w:t xml:space="preserve">(localDir)</w:t>
+            </w:r>
+          </w:p>
+        </w:tc>
+        <w:tc>
+          <w:p>
+            <w:pPr>
+              <w:pStyle w:val="Compact"/>
+              <w:jc w:val="left"/>
+            </w:pPr>
+            <w:r>
+              <w:t xml:space="preserve">serviert die gebauten Seiten (App + öffentliche Consumer- &amp; Token-Lookup-Views)</w:t>
             </w:r>
             <w:r>
               <w:t xml:space="preserve"> </w:t>
@@ -1853,18 +1875,10 @@
                 <w:bCs/>
                 <w:b/>
               </w:rPr>
-              <w:t xml:space="preserve">HTML5 Application Repository</w:t>
-            </w:r>
-          </w:p>
-        </w:tc>
-        <w:tc>
-          <w:p>
-            <w:pPr>
-              <w:pStyle w:val="Compact"/>
-              <w:jc w:val="left"/>
-            </w:pPr>
-            <w:r>
-              <w:t xml:space="preserve">serviert die gebaute SPA, leitet API weiter</w:t>
+              <w:t xml:space="preserve">aus dem eigenen Container</w:t>
+            </w:r>
+            <w:r>
+              <w:t xml:space="preserve">, leitet API weiter</w:t>
             </w:r>
           </w:p>
         </w:tc>
@@ -1884,7 +1898,7 @@
       <w:pPr>
         <w:numPr>
           <w:ilvl w:val="0"/>
-          <w:numId w:val="1001"/>
+          <w:numId w:val="1002"/>
         </w:numPr>
         <w:pStyle w:val="Compact"/>
       </w:pPr>
@@ -1893,7 +1907,7 @@
           <w:bCs/>
           <w:b/>
         </w:rPr>
-        <w:t xml:space="preserve">Node.js vs. Cloud Foundry:</w:t>
+        <w:t xml:space="preserve">Node.js vs. Cloud Foundry:</w:t>
       </w:r>
       <w:r>
         <w:t xml:space="preserve"> </w:t>
@@ -1947,13 +1961,7 @@
         <w:t xml:space="preserve"> </w:t>
       </w:r>
       <w:r>
-        <w:t xml:space="preserve">Node.js</w:t>
-      </w:r>
-      <w:r>
-        <w:t xml:space="preserve">“</w:t>
-      </w:r>
-      <w:r>
-        <w:t xml:space="preserve">, sondern „CF</w:t>
+        <w:t xml:space="preserve">Node.js", sondern „CF</w:t>
       </w:r>
       <w:r>
         <w:t xml:space="preserve"> </w:t>
@@ -1969,20 +1977,14 @@
         <w:t xml:space="preserve"> </w:t>
       </w:r>
       <w:r>
-        <w:t xml:space="preserve">Node.js</w:t>
-      </w:r>
-      <w:r>
-        <w:t xml:space="preserve">”</w:t>
-      </w:r>
-      <w:r>
-        <w:t xml:space="preserve">.</w:t>
+        <w:t xml:space="preserve">Node.js".</w:t>
       </w:r>
     </w:p>
     <w:p>
       <w:pPr>
         <w:numPr>
           <w:ilvl w:val="0"/>
-          <w:numId w:val="1001"/>
+          <w:numId w:val="1002"/>
         </w:numPr>
         <w:pStyle w:val="Compact"/>
       </w:pPr>
@@ -2030,7 +2032,7 @@
       <w:pPr>
         <w:numPr>
           <w:ilvl w:val="0"/>
-          <w:numId w:val="1001"/>
+          <w:numId w:val="1002"/>
         </w:numPr>
         <w:pStyle w:val="Compact"/>
       </w:pPr>
@@ -2043,6 +2045,71 @@
       </w:r>
       <w:r>
         <w:t xml:space="preserve">, nicht daneben: Express ist die HTTP-Basis, CAP die Schicht darüber — die Public-REST-Routen klinken sich direkt in Express ein.</w:t>
+      </w:r>
+    </w:p>
+    <w:p>
+      <w:pPr>
+        <w:numPr>
+          <w:ilvl w:val="0"/>
+          <w:numId w:val="1002"/>
+        </w:numPr>
+        <w:pStyle w:val="Compact"/>
+      </w:pPr>
+      <w:r>
+        <w:rPr>
+          <w:bCs/>
+          <w:b/>
+        </w:rPr>
+        <w:t xml:space="preserve">Drei Frontend-Einstiege:</w:t>
+      </w:r>
+      <w:r>
+        <w:t xml:space="preserve"> </w:t>
+      </w:r>
+      <w:r>
+        <w:t xml:space="preserve">ein authentifizierter Studio-Einstieg (</w:t>
+      </w:r>
+      <w:r>
+        <w:rPr>
+          <w:rStyle w:val="VerbatimChar"/>
+        </w:rPr>
+        <w:t xml:space="preserve">index.html</w:t>
+      </w:r>
+      <w:r>
+        <w:t xml:space="preserve">) und</w:t>
+      </w:r>
+      <w:r>
+        <w:t xml:space="preserve"> </w:t>
+      </w:r>
+      <w:r>
+        <w:rPr>
+          <w:bCs/>
+          <w:b/>
+        </w:rPr>
+        <w:t xml:space="preserve">zwei öffentliche Views ohne Login</w:t>
+      </w:r>
+      <w:r>
+        <w:t xml:space="preserve"> </w:t>
+      </w:r>
+      <w:r>
+        <w:t xml:space="preserve">— der Consumer-Pass (</w:t>
+      </w:r>
+      <w:r>
+        <w:rPr>
+          <w:rStyle w:val="VerbatimChar"/>
+        </w:rPr>
+        <w:t xml:space="preserve">consumer.html</w:t>
+      </w:r>
+      <w:r>
+        <w:t xml:space="preserve">, vom QR-Scan) und die Token-Eingabeseite (</w:t>
+      </w:r>
+      <w:r>
+        <w:rPr>
+          <w:rStyle w:val="VerbatimChar"/>
+        </w:rPr>
+        <w:t xml:space="preserve">lookup.html</w:t>
+      </w:r>
+      <w:r>
+        <w:t xml:space="preserve">, manuelle Token-Eingabe → Consumer-Pass).</w:t>
       </w:r>
     </w:p>
     <w:bookmarkEnd w:id="26"/>
@@ -2227,26 +2294,7 @@
         <w:t xml:space="preserve">Application Router</w:t>
       </w:r>
       <w:r>
-        <w:t xml:space="preserve"> </w:t>
-      </w:r>
-      <w:r>
-        <w:t xml:space="preserve">und das</w:t>
-      </w:r>
-      <w:r>
-        <w:t xml:space="preserve"> </w:t>
-      </w:r>
-      <w:r>
-        <w:rPr>
-          <w:bCs/>
-          <w:b/>
-        </w:rPr>
-        <w:t xml:space="preserve">HTML5-Repository</w:t>
-      </w:r>
-      <w:r>
-        <w:t xml:space="preserve"> </w:t>
-      </w:r>
-      <w:r>
-        <w:t xml:space="preserve">— beide Repos teilen sich dieselbe XSUAA."</w:t>
+        <w:t xml:space="preserve">, der die gebauten Seiten — die Studio-App plus zwei öffentliche Views (Consumer-Pass und Token-Lookup) — aus seinem eigenen Container serviert — beide MTAs teilen sich dieselbe XSUAA."</w:t>
       </w:r>
     </w:p>
     <w:p>
@@ -2258,13 +2306,13 @@
     </w:p>
     <w:bookmarkEnd w:id="27"/>
     <w:bookmarkEnd w:id="28"/>
-    <w:bookmarkStart w:id="38" w:name="software-architektur"/>
+    <w:bookmarkStart w:id="31" w:name="X744b4621328395d06395c9f95792269b503de5c"/>
     <w:p>
       <w:pPr>
         <w:pStyle w:val="Heading2"/>
       </w:pPr>
       <w:r>
-        <w:t xml:space="preserve">2. Software-Architektur</w:t>
+        <w:t xml:space="preserve">1a. Warum dieser Stack — Begründung der Wahl</w:t>
       </w:r>
     </w:p>
     <w:p>
@@ -2272,25 +2320,93 @@
         <w:pStyle w:val="FirstParagraph"/>
       </w:pPr>
       <w:r>
-        <w:rPr>
-          <w:iCs/>
-          <w:i/>
-        </w:rPr>
-        <w:t xml:space="preserve">Sicht: WIE der Code aufgebaut ist. Der Request fließt top-down durch die Schichten.</w:t>
+        <w:t xml:space="preserve">Drei Leitlinien:</w:t>
+      </w:r>
+      <w:r>
+        <w:t xml:space="preserve"> </w:t>
+      </w:r>
+      <w:r>
+        <w:rPr>
+          <w:bCs/>
+          <w:b/>
+        </w:rPr>
+        <w:t xml:space="preserve">BTP-nativ</w:t>
+      </w:r>
+      <w:r>
+        <w:t xml:space="preserve"> </w:t>
+      </w:r>
+      <w:r>
+        <w:t xml:space="preserve">(gemanagte Plattformdienste statt Eigenbetrieb),</w:t>
+      </w:r>
+      <w:r>
+        <w:t xml:space="preserve"> </w:t>
+      </w:r>
+      <w:r>
+        <w:rPr>
+          <w:bCs/>
+          <w:b/>
+        </w:rPr>
+        <w:t xml:space="preserve">etablierte Werkzeuge mit großer Community</w:t>
+      </w:r>
+      <w:r>
+        <w:t xml:space="preserve"> </w:t>
+      </w:r>
+      <w:r>
+        <w:t xml:space="preserve">(wartbar durch ein wechselndes</w:t>
+      </w:r>
+      <w:r>
+        <w:t xml:space="preserve"> </w:t>
+      </w:r>
+      <w:r>
+        <w:t xml:space="preserve">Studententeam, leicht zu lernen und zu besetzen) und</w:t>
+      </w:r>
+      <w:r>
+        <w:t xml:space="preserve"> </w:t>
+      </w:r>
+      <w:r>
+        <w:rPr>
+          <w:bCs/>
+          <w:b/>
+        </w:rPr>
+        <w:t xml:space="preserve">Skalierbarkeit ohne</w:t>
+      </w:r>
+      <w:r>
+        <w:rPr>
+          <w:bCs/>
+          <w:b/>
+        </w:rPr>
+        <w:t xml:space="preserve"> </w:t>
+      </w:r>
+      <w:r>
+        <w:rPr>
+          <w:bCs/>
+          <w:b/>
+        </w:rPr>
+        <w:t xml:space="preserve">Betriebsaufwand</w:t>
+      </w:r>
+      <w:r>
+        <w:t xml:space="preserve"> </w:t>
+      </w:r>
+      <w:r>
+        <w:t xml:space="preserve">(horizontale Skalierung übernimmt die Plattform).</w:t>
+      </w:r>
+    </w:p>
+    <w:bookmarkStart w:id="29" w:name="plattform--backend"/>
+    <w:p>
+      <w:pPr>
+        <w:pStyle w:val="Heading3"/>
+      </w:pPr>
+      <w:r>
+        <w:t xml:space="preserve">Plattform &amp; Backend</w:t>
       </w:r>
     </w:p>
     <w:tbl>
       <w:tblPr>
         <w:tblStyle w:val="Table"/>
-        <w:tblW w:type="pct" w:w="5000.0"/>
+        <w:tblW w:type="pct" w:w="0.0"/>
         <w:tblLook w:firstRow="1" w:lastRow="0" w:firstColumn="0" w:lastColumn="0" w:noHBand="0" w:noVBand="0" w:val="0020"/>
       </w:tblPr>
-      <w:tblGrid>
-        <w:gridCol w:w="1980"/>
-        <w:gridCol w:w="1980"/>
-        <w:gridCol w:w="1980"/>
-        <w:gridCol w:w="1980"/>
-      </w:tblGrid>
+      <w:tblGrid/>
       <w:tr>
         <w:tc>
           <w:p>
@@ -2299,40 +2415,18 @@
               <w:jc w:val="left"/>
             </w:pPr>
             <w:r>
-              <w:t xml:space="preserve">Schicht</w:t>
-            </w:r>
-          </w:p>
-        </w:tc>
-        <w:tc>
-          <w:p>
-            <w:pPr>
-              <w:pStyle w:val="Compact"/>
-              <w:jc w:val="left"/>
-            </w:pPr>
-            <w:r>
-              <w:t xml:space="preserve">Konkrete Komponente (Datei)</w:t>
-            </w:r>
-          </w:p>
-        </w:tc>
-        <w:tc>
-          <w:p>
-            <w:pPr>
-              <w:pStyle w:val="Compact"/>
-              <w:jc w:val="left"/>
-            </w:pPr>
-            <w:r>
-              <w:t xml:space="preserve">Herkunft</w:t>
-            </w:r>
-          </w:p>
-        </w:tc>
-        <w:tc>
-          <w:p>
-            <w:pPr>
-              <w:pStyle w:val="Compact"/>
-              <w:jc w:val="left"/>
-            </w:pPr>
-            <w:r>
-              <w:t xml:space="preserve">Aufgabe</w:t>
+              <w:t xml:space="preserve">Technologie</w:t>
+            </w:r>
+          </w:p>
+        </w:tc>
+        <w:tc>
+          <w:p>
+            <w:pPr>
+              <w:pStyle w:val="Compact"/>
+              <w:jc w:val="left"/>
+            </w:pPr>
+            <w:r>
+              <w:t xml:space="preserve">Warum gewählt</w:t>
             </w:r>
           </w:p>
         </w:tc>
@@ -2349,72 +2443,18 @@
                 <w:bCs/>
                 <w:b/>
               </w:rPr>
-              <w:t xml:space="preserve">Client</w:t>
-            </w:r>
-          </w:p>
-        </w:tc>
-        <w:tc>
-          <w:p>
-            <w:pPr>
-              <w:pStyle w:val="Compact"/>
-              <w:jc w:val="left"/>
-            </w:pPr>
-            <w:r>
-              <w:t xml:space="preserve">React-SPA + Consumer-View (Frontend) · HTTP-Client (Behörde)</w:t>
-            </w:r>
-          </w:p>
-        </w:tc>
-        <w:tc>
-          <w:p>
-            <w:pPr>
-              <w:pStyle w:val="Compact"/>
-              <w:jc w:val="left"/>
-            </w:pPr>
-            <w:r>
-              <w:t xml:space="preserve">selbst / extern</w:t>
-            </w:r>
-          </w:p>
-        </w:tc>
-        <w:tc>
-          <w:p>
-            <w:pPr>
-              <w:pStyle w:val="Compact"/>
-              <w:jc w:val="left"/>
-            </w:pPr>
-            <w:r>
-              <w:t xml:space="preserve">sendet Anfragen, zeigt an —</w:t>
-            </w:r>
-            <w:r>
-              <w:t xml:space="preserve"> </w:t>
-            </w:r>
-            <w:r>
-              <w:rPr>
-                <w:bCs/>
-                <w:b/>
-              </w:rPr>
-              <w:t xml:space="preserve">keine</w:t>
-            </w:r>
-            <w:r>
-              <w:t xml:space="preserve"> </w:t>
-            </w:r>
-            <w:r>
-              <w:t xml:space="preserve">Regeln,</w:t>
-            </w:r>
-            <w:r>
-              <w:t xml:space="preserve"> </w:t>
-            </w:r>
-            <w:r>
-              <w:rPr>
-                <w:bCs/>
-                <w:b/>
-              </w:rPr>
-              <w:t xml:space="preserve">keine</w:t>
-            </w:r>
-            <w:r>
-              <w:t xml:space="preserve"> </w:t>
-            </w:r>
-            <w:r>
-              <w:t xml:space="preserve">Secrets</w:t>
+              <w:t xml:space="preserve">SAP BTP / Cloud Foundry</w:t>
+            </w:r>
+          </w:p>
+        </w:tc>
+        <w:tc>
+          <w:p>
+            <w:pPr>
+              <w:pStyle w:val="Compact"/>
+              <w:jc w:val="left"/>
+            </w:pPr>
+            <w:r>
+              <w:t xml:space="preserve">Projektkontext ist das SAP-Ökosystem; gemanagte HANA + XSUAA → keine eigene Infrastruktur; horizontale Skalierung über zusätzliche CF-Instanzen ohne Ops-Aufwand.</w:t>
             </w:r>
           </w:p>
         </w:tc>
@@ -2431,40 +2471,33 @@
                 <w:bCs/>
                 <w:b/>
               </w:rPr>
-              <w:t xml:space="preserve">Platform boundary</w:t>
-            </w:r>
-          </w:p>
-        </w:tc>
-        <w:tc>
-          <w:p>
-            <w:pPr>
-              <w:pStyle w:val="Compact"/>
-              <w:jc w:val="left"/>
-            </w:pPr>
-            <w:r>
-              <w:t xml:space="preserve">Application Router + XSUAA</w:t>
-            </w:r>
-          </w:p>
-        </w:tc>
-        <w:tc>
-          <w:p>
-            <w:pPr>
-              <w:pStyle w:val="Compact"/>
-              <w:jc w:val="left"/>
-            </w:pPr>
-            <w:r>
-              <w:t xml:space="preserve">Plattform</w:t>
-            </w:r>
-          </w:p>
-        </w:tc>
-        <w:tc>
-          <w:p>
-            <w:pPr>
-              <w:pStyle w:val="Compact"/>
-              <w:jc w:val="left"/>
-            </w:pPr>
-            <w:r>
-              <w:t xml:space="preserve">lässt rein, prüft „eingeloggt ja/nein"</w:t>
+              <w:t xml:space="preserve">SAP CAP</w:t>
+            </w:r>
+            <w:r>
+              <w:t xml:space="preserve"> </w:t>
+            </w:r>
+            <w:r>
+              <w:t xml:space="preserve">(</w:t>
+            </w:r>
+            <w:r>
+              <w:rPr>
+                <w:rStyle w:val="VerbatimChar"/>
+              </w:rPr>
+              <w:t xml:space="preserve">@sap/cds</w:t>
+            </w:r>
+            <w:r>
+              <w:t xml:space="preserve">)</w:t>
+            </w:r>
+          </w:p>
+        </w:tc>
+        <w:tc>
+          <w:p>
+            <w:pPr>
+              <w:pStyle w:val="Compact"/>
+              <w:jc w:val="left"/>
+            </w:pPr>
+            <w:r>
+              <w:t xml:space="preserve">De-facto-Standard für BTP-Business-Apps: liefert OData, HANA-Integration, XSUAA-Auth und lokales Mocking out-of-the-box → wenig Boilerplate; SAP-gepflegt, gut dokumentiert, aktive Enterprise-Community.</w:t>
             </w:r>
           </w:p>
         </w:tc>
@@ -2481,6 +2514,646 @@
                 <w:bCs/>
                 <w:b/>
               </w:rPr>
+              <w:t xml:space="preserve">Node.js</w:t>
+            </w:r>
+          </w:p>
+        </w:tc>
+        <w:tc>
+          <w:p>
+            <w:pPr>
+              <w:pStyle w:val="Compact"/>
+              <w:jc w:val="left"/>
+            </w:pPr>
+            <w:r>
+              <w:t xml:space="preserve">CAP-Runtime; riesiges npm-Ökosystem und großer Entwicklerpool (wichtig für ein wechselndes Team); non-blocking I/O passt zur I/O-lastigen API.</w:t>
+            </w:r>
+          </w:p>
+        </w:tc>
+      </w:tr>
+      <w:tr>
+        <w:tc>
+          <w:p>
+            <w:pPr>
+              <w:pStyle w:val="Compact"/>
+              <w:jc w:val="left"/>
+            </w:pPr>
+            <w:r>
+              <w:rPr>
+                <w:bCs/>
+                <w:b/>
+              </w:rPr>
+              <w:t xml:space="preserve">OData V4</w:t>
+            </w:r>
+          </w:p>
+        </w:tc>
+        <w:tc>
+          <w:p>
+            <w:pPr>
+              <w:pStyle w:val="Compact"/>
+              <w:jc w:val="left"/>
+            </w:pPr>
+            <w:r>
+              <w:t xml:space="preserve">SAP-/Fiori-Standard; eingebautes Querying (</w:t>
+            </w:r>
+            <w:r>
+              <w:rPr>
+                <w:rStyle w:val="VerbatimChar"/>
+              </w:rPr>
+              <w:t xml:space="preserve">$filter</w:t>
+            </w:r>
+            <w:r>
+              <w:t xml:space="preserve">/</w:t>
+            </w:r>
+            <w:r>
+              <w:rPr>
+                <w:rStyle w:val="VerbatimChar"/>
+              </w:rPr>
+              <w:t xml:space="preserve">$expand</w:t>
+            </w:r>
+            <w:r>
+              <w:t xml:space="preserve">/</w:t>
+            </w:r>
+            <w:r>
+              <w:rPr>
+                <w:rStyle w:val="VerbatimChar"/>
+              </w:rPr>
+              <w:t xml:space="preserve">$count</w:t>
+            </w:r>
+            <w:r>
+              <w:t xml:space="preserve">), Metadaten und generierte Clients → keine eigene API-Spezifikation nötig.</w:t>
+            </w:r>
+          </w:p>
+        </w:tc>
+      </w:tr>
+      <w:tr>
+        <w:tc>
+          <w:p>
+            <w:pPr>
+              <w:pStyle w:val="Compact"/>
+              <w:jc w:val="left"/>
+            </w:pPr>
+            <w:r>
+              <w:rPr>
+                <w:bCs/>
+                <w:b/>
+              </w:rPr>
+              <w:t xml:space="preserve">SAP HANA Cloud</w:t>
+            </w:r>
+            <w:r>
+              <w:t xml:space="preserve"> </w:t>
+            </w:r>
+            <w:r>
+              <w:t xml:space="preserve">/</w:t>
+            </w:r>
+            <w:r>
+              <w:t xml:space="preserve"> </w:t>
+            </w:r>
+            <w:r>
+              <w:rPr>
+                <w:bCs/>
+                <w:b/>
+              </w:rPr>
+              <w:t xml:space="preserve">SQLite</w:t>
+            </w:r>
+          </w:p>
+        </w:tc>
+        <w:tc>
+          <w:p>
+            <w:pPr>
+              <w:pStyle w:val="Compact"/>
+              <w:jc w:val="left"/>
+            </w:pPr>
+            <w:r>
+              <w:t xml:space="preserve">HANA = skalierbare gemanagte DB des SAP-Stacks; SQLite → lokale Entwicklung ohne DB-Setup; CAP abstrahiert beide → identischer Code in Dev und Prod.</w:t>
+            </w:r>
+          </w:p>
+        </w:tc>
+      </w:tr>
+      <w:tr>
+        <w:tc>
+          <w:p>
+            <w:pPr>
+              <w:pStyle w:val="Compact"/>
+              <w:jc w:val="left"/>
+            </w:pPr>
+            <w:r>
+              <w:rPr>
+                <w:bCs/>
+                <w:b/>
+              </w:rPr>
+              <w:t xml:space="preserve">XSUAA + Application Router</w:t>
+            </w:r>
+          </w:p>
+        </w:tc>
+        <w:tc>
+          <w:p>
+            <w:pPr>
+              <w:pStyle w:val="Compact"/>
+              <w:jc w:val="left"/>
+            </w:pPr>
+            <w:r>
+              <w:t xml:space="preserve">Plattform-Standard für OAuth2 — kein selbstgebauter Auth-Code; ein einziger Origin (kein CORS).</w:t>
+            </w:r>
+          </w:p>
+        </w:tc>
+      </w:tr>
+      <w:tr>
+        <w:tc>
+          <w:p>
+            <w:pPr>
+              <w:pStyle w:val="Compact"/>
+              <w:jc w:val="left"/>
+            </w:pPr>
+            <w:r>
+              <w:rPr>
+                <w:bCs/>
+                <w:b/>
+              </w:rPr>
+              <w:t xml:space="preserve">MTA +</w:t>
+            </w:r>
+            <w:r>
+              <w:rPr>
+                <w:bCs/>
+                <w:b/>
+              </w:rPr>
+              <w:t xml:space="preserve"> </w:t>
+            </w:r>
+            <w:r>
+              <w:rPr>
+                <w:rStyle w:val="VerbatimChar"/>
+                <w:bCs/>
+                <w:b/>
+              </w:rPr>
+              <w:t xml:space="preserve">mbt</w:t>
+            </w:r>
+          </w:p>
+        </w:tc>
+        <w:tc>
+          <w:p>
+            <w:pPr>
+              <w:pStyle w:val="Compact"/>
+              <w:jc w:val="left"/>
+            </w:pPr>
+            <w:r>
+              <w:t xml:space="preserve">BTP-Standard-Deployment: ein Deskriptor baut alle Module, legt Services an und verdrahtet Bindings</w:t>
+            </w:r>
+            <w:r>
+              <w:t xml:space="preserve"> </w:t>
+            </w:r>
+            <w:r>
+              <w:rPr>
+                <w:bCs/>
+                <w:b/>
+              </w:rPr>
+              <w:t xml:space="preserve">atomar</w:t>
+            </w:r>
+            <w:r>
+              <w:t xml:space="preserve"> </w:t>
+            </w:r>
+            <w:r>
+              <w:t xml:space="preserve">(Rollback bei Fehler) — reproduzierbar über Spaces hinweg.</w:t>
+            </w:r>
+          </w:p>
+        </w:tc>
+      </w:tr>
+    </w:tbl>
+    <w:bookmarkEnd w:id="29"/>
+    <w:bookmarkStart w:id="30" w:name="frontend-1"/>
+    <w:p>
+      <w:pPr>
+        <w:pStyle w:val="Heading3"/>
+      </w:pPr>
+      <w:r>
+        <w:t xml:space="preserve">Frontend</w:t>
+      </w:r>
+    </w:p>
+    <w:tbl>
+      <w:tblPr>
+        <w:tblStyle w:val="Table"/>
+        <w:tblW w:type="pct" w:w="0.0"/>
+        <w:tblLook w:firstRow="1" w:lastRow="0" w:firstColumn="0" w:lastColumn="0" w:noHBand="0" w:noVBand="0" w:val="0020"/>
+      </w:tblPr>
+      <w:tblGrid/>
+      <w:tr>
+        <w:tc>
+          <w:p>
+            <w:pPr>
+              <w:pStyle w:val="Compact"/>
+              <w:jc w:val="left"/>
+            </w:pPr>
+            <w:r>
+              <w:t xml:space="preserve">Technologie</w:t>
+            </w:r>
+          </w:p>
+        </w:tc>
+        <w:tc>
+          <w:p>
+            <w:pPr>
+              <w:pStyle w:val="Compact"/>
+              <w:jc w:val="left"/>
+            </w:pPr>
+            <w:r>
+              <w:t xml:space="preserve">Warum gewählt</w:t>
+            </w:r>
+          </w:p>
+        </w:tc>
+      </w:tr>
+      <w:tr>
+        <w:tc>
+          <w:p>
+            <w:pPr>
+              <w:pStyle w:val="Compact"/>
+              <w:jc w:val="left"/>
+            </w:pPr>
+            <w:r>
+              <w:rPr>
+                <w:bCs/>
+                <w:b/>
+              </w:rPr>
+              <w:t xml:space="preserve">React 18</w:t>
+            </w:r>
+          </w:p>
+        </w:tc>
+        <w:tc>
+          <w:p>
+            <w:pPr>
+              <w:pStyle w:val="Compact"/>
+              <w:jc w:val="left"/>
+            </w:pPr>
+            <w:r>
+              <w:t xml:space="preserve">Größte Frontend-Community + Ökosystem → viele Bibliotheken, Lernressourcen und verfügbare Entwickler; Komponentenmodell → wartbar und teamfähig.</w:t>
+            </w:r>
+          </w:p>
+        </w:tc>
+      </w:tr>
+      <w:tr>
+        <w:tc>
+          <w:p>
+            <w:pPr>
+              <w:pStyle w:val="Compact"/>
+              <w:jc w:val="left"/>
+            </w:pPr>
+            <w:r>
+              <w:rPr>
+                <w:bCs/>
+                <w:b/>
+              </w:rPr>
+              <w:t xml:space="preserve">Vite</w:t>
+            </w:r>
+          </w:p>
+        </w:tc>
+        <w:tc>
+          <w:p>
+            <w:pPr>
+              <w:pStyle w:val="Compact"/>
+              <w:jc w:val="left"/>
+            </w:pPr>
+            <w:r>
+              <w:t xml:space="preserve">Schneller HMR-Dev-Server + schlanker Prod-Build; einfache Multi-Entry-Konfiguration (App + Consumer-View + Token-Lookup); aktueller De-facto-Standard.</w:t>
+            </w:r>
+          </w:p>
+        </w:tc>
+      </w:tr>
+      <w:tr>
+        <w:tc>
+          <w:p>
+            <w:pPr>
+              <w:pStyle w:val="Compact"/>
+              <w:jc w:val="left"/>
+            </w:pPr>
+            <w:r>
+              <w:rPr>
+                <w:bCs/>
+                <w:b/>
+              </w:rPr>
+              <w:t xml:space="preserve">Tailwind CSS</w:t>
+            </w:r>
+          </w:p>
+        </w:tc>
+        <w:tc>
+          <w:p>
+            <w:pPr>
+              <w:pStyle w:val="Compact"/>
+              <w:jc w:val="left"/>
+            </w:pPr>
+            <w:r>
+              <w:t xml:space="preserve">Utility-first → schnelle, konsistente UI ohne CSS-Namens-Overhead; ungenutzte Klassen werden entfernt → kleines Bundle; kein Library-Lock-in.</w:t>
+            </w:r>
+          </w:p>
+        </w:tc>
+      </w:tr>
+      <w:tr>
+        <w:tc>
+          <w:p>
+            <w:pPr>
+              <w:pStyle w:val="Compact"/>
+              <w:jc w:val="left"/>
+            </w:pPr>
+            <w:r>
+              <w:rPr>
+                <w:bCs/>
+                <w:b/>
+              </w:rPr>
+              <w:t xml:space="preserve">TanStack Query</w:t>
+            </w:r>
+          </w:p>
+        </w:tc>
+        <w:tc>
+          <w:p>
+            <w:pPr>
+              <w:pStyle w:val="Compact"/>
+              <w:jc w:val="left"/>
+            </w:pPr>
+            <w:r>
+              <w:t xml:space="preserve">Bewährtes Caching, Invalidierung und Lade-/Fehlerzustände → deutlich weniger Boilerplate als selbst gebauter Fetch-State.</w:t>
+            </w:r>
+          </w:p>
+        </w:tc>
+      </w:tr>
+      <w:tr>
+        <w:tc>
+          <w:p>
+            <w:pPr>
+              <w:pStyle w:val="Compact"/>
+              <w:jc w:val="left"/>
+            </w:pPr>
+            <w:r>
+              <w:rPr>
+                <w:bCs/>
+                <w:b/>
+              </w:rPr>
+              <w:t xml:space="preserve">React Router</w:t>
+            </w:r>
+          </w:p>
+        </w:tc>
+        <w:tc>
+          <w:p>
+            <w:pPr>
+              <w:pStyle w:val="Compact"/>
+              <w:jc w:val="left"/>
+            </w:pPr>
+            <w:r>
+              <w:t xml:space="preserve">De-facto-Standard-Routing für React-SPAs.</w:t>
+            </w:r>
+          </w:p>
+        </w:tc>
+      </w:tr>
+      <w:tr>
+        <w:tc>
+          <w:p>
+            <w:pPr>
+              <w:pStyle w:val="Compact"/>
+              <w:jc w:val="left"/>
+            </w:pPr>
+            <w:r>
+              <w:rPr>
+                <w:bCs/>
+                <w:b/>
+              </w:rPr>
+              <w:t xml:space="preserve">JSDoc statt TypeScript</w:t>
+            </w:r>
+          </w:p>
+        </w:tc>
+        <w:tc>
+          <w:p>
+            <w:pPr>
+              <w:pStyle w:val="Compact"/>
+              <w:jc w:val="left"/>
+            </w:pPr>
+            <w:r>
+              <w:t xml:space="preserve">Autocomplete + Typhinweise ohne zusätzlichen Build-Schritt — bewusste Komplexitätsreduktion für ein kleines Team.</w:t>
+            </w:r>
+          </w:p>
+        </w:tc>
+      </w:tr>
+    </w:tbl>
+    <w:p>
+      <w:r>
+        <w:pict>
+          <v:rect style="width:0;height:1.5pt" o:hralign="center" o:hrstd="t" o:hr="t"/>
+        </w:pict>
+      </w:r>
+    </w:p>
+    <w:bookmarkEnd w:id="30"/>
+    <w:bookmarkEnd w:id="31"/>
+    <w:bookmarkStart w:id="41" w:name="Xf8d3674bc1a7952ae278cd482fb6ae3132a05c7"/>
+    <w:p>
+      <w:pPr>
+        <w:pStyle w:val="Heading2"/>
+      </w:pPr>
+      <w:r>
+        <w:t xml:space="preserve">2. Software-Architektur</w:t>
+      </w:r>
+    </w:p>
+    <w:p>
+      <w:pPr>
+        <w:pStyle w:val="FirstParagraph"/>
+      </w:pPr>
+      <w:r>
+        <w:rPr>
+          <w:iCs/>
+          <w:i/>
+        </w:rPr>
+        <w:t xml:space="preserve">Sicht: WIE der Code aufgebaut ist. Der Request fließt top-down durch die Schichten.</w:t>
+      </w:r>
+    </w:p>
+    <w:tbl>
+      <w:tblPr>
+        <w:tblStyle w:val="Table"/>
+        <w:tblW w:type="pct" w:w="0.0"/>
+        <w:tblLook w:firstRow="1" w:lastRow="0" w:firstColumn="0" w:lastColumn="0" w:noHBand="0" w:noVBand="0" w:val="0020"/>
+      </w:tblPr>
+      <w:tblGrid/>
+      <w:tr>
+        <w:tc>
+          <w:p>
+            <w:pPr>
+              <w:pStyle w:val="Compact"/>
+              <w:jc w:val="left"/>
+            </w:pPr>
+            <w:r>
+              <w:t xml:space="preserve">Schicht</w:t>
+            </w:r>
+          </w:p>
+        </w:tc>
+        <w:tc>
+          <w:p>
+            <w:pPr>
+              <w:pStyle w:val="Compact"/>
+              <w:jc w:val="left"/>
+            </w:pPr>
+            <w:r>
+              <w:t xml:space="preserve">Konkrete Komponente (Datei)</w:t>
+            </w:r>
+          </w:p>
+        </w:tc>
+        <w:tc>
+          <w:p>
+            <w:pPr>
+              <w:pStyle w:val="Compact"/>
+              <w:jc w:val="left"/>
+            </w:pPr>
+            <w:r>
+              <w:t xml:space="preserve">Herkunft</w:t>
+            </w:r>
+          </w:p>
+        </w:tc>
+        <w:tc>
+          <w:p>
+            <w:pPr>
+              <w:pStyle w:val="Compact"/>
+              <w:jc w:val="left"/>
+            </w:pPr>
+            <w:r>
+              <w:t xml:space="preserve">Aufgabe</w:t>
+            </w:r>
+          </w:p>
+        </w:tc>
+      </w:tr>
+      <w:tr>
+        <w:tc>
+          <w:p>
+            <w:pPr>
+              <w:pStyle w:val="Compact"/>
+              <w:jc w:val="left"/>
+            </w:pPr>
+            <w:r>
+              <w:rPr>
+                <w:bCs/>
+                <w:b/>
+              </w:rPr>
+              <w:t xml:space="preserve">Client</w:t>
+            </w:r>
+          </w:p>
+        </w:tc>
+        <w:tc>
+          <w:p>
+            <w:pPr>
+              <w:pStyle w:val="Compact"/>
+              <w:jc w:val="left"/>
+            </w:pPr>
+            <w:r>
+              <w:t xml:space="preserve">React-SPA (Login) + Consumer-View + öffentliche Token-Lookup-Seite (Frontend) · HTTP-Client (Behörde)</w:t>
+            </w:r>
+          </w:p>
+        </w:tc>
+        <w:tc>
+          <w:p>
+            <w:pPr>
+              <w:pStyle w:val="Compact"/>
+              <w:jc w:val="left"/>
+            </w:pPr>
+            <w:r>
+              <w:t xml:space="preserve">selbst / extern</w:t>
+            </w:r>
+          </w:p>
+        </w:tc>
+        <w:tc>
+          <w:p>
+            <w:pPr>
+              <w:pStyle w:val="Compact"/>
+              <w:jc w:val="left"/>
+            </w:pPr>
+            <w:r>
+              <w:t xml:space="preserve">sendet Anfragen, zeigt an —</w:t>
+            </w:r>
+            <w:r>
+              <w:t xml:space="preserve"> </w:t>
+            </w:r>
+            <w:r>
+              <w:rPr>
+                <w:bCs/>
+                <w:b/>
+              </w:rPr>
+              <w:t xml:space="preserve">keine</w:t>
+            </w:r>
+            <w:r>
+              <w:t xml:space="preserve"> </w:t>
+            </w:r>
+            <w:r>
+              <w:t xml:space="preserve">Regeln,</w:t>
+            </w:r>
+            <w:r>
+              <w:t xml:space="preserve"> </w:t>
+            </w:r>
+            <w:r>
+              <w:rPr>
+                <w:bCs/>
+                <w:b/>
+              </w:rPr>
+              <w:t xml:space="preserve">keine</w:t>
+            </w:r>
+            <w:r>
+              <w:t xml:space="preserve"> </w:t>
+            </w:r>
+            <w:r>
+              <w:t xml:space="preserve">Secrets</w:t>
+            </w:r>
+          </w:p>
+        </w:tc>
+      </w:tr>
+      <w:tr>
+        <w:tc>
+          <w:p>
+            <w:pPr>
+              <w:pStyle w:val="Compact"/>
+              <w:jc w:val="left"/>
+            </w:pPr>
+            <w:r>
+              <w:rPr>
+                <w:bCs/>
+                <w:b/>
+              </w:rPr>
+              <w:t xml:space="preserve">Platform boundary</w:t>
+            </w:r>
+          </w:p>
+        </w:tc>
+        <w:tc>
+          <w:p>
+            <w:pPr>
+              <w:pStyle w:val="Compact"/>
+              <w:jc w:val="left"/>
+            </w:pPr>
+            <w:r>
+              <w:t xml:space="preserve">Application Router + XSUAA</w:t>
+            </w:r>
+          </w:p>
+        </w:tc>
+        <w:tc>
+          <w:p>
+            <w:pPr>
+              <w:pStyle w:val="Compact"/>
+              <w:jc w:val="left"/>
+            </w:pPr>
+            <w:r>
+              <w:t xml:space="preserve">Plattform</w:t>
+            </w:r>
+          </w:p>
+        </w:tc>
+        <w:tc>
+          <w:p>
+            <w:pPr>
+              <w:pStyle w:val="Compact"/>
+              <w:jc w:val="left"/>
+            </w:pPr>
+            <w:r>
+              <w:t xml:space="preserve">lässt rein, prüft „eingeloggt ja/nein"</w:t>
+            </w:r>
+          </w:p>
+        </w:tc>
+      </w:tr>
+      <w:tr>
+        <w:tc>
+          <w:p>
+            <w:pPr>
+              <w:pStyle w:val="Compact"/>
+              <w:jc w:val="left"/>
+            </w:pPr>
+            <w:r>
+              <w:rPr>
+                <w:bCs/>
+                <w:b/>
+              </w:rPr>
               <w:t xml:space="preserve">API · Vertrag</w:t>
             </w:r>
           </w:p>
@@ -2491,7 +3164,7 @@
               <w:pStyle w:val="Compact"/>
               <w:jc w:val="left"/>
             </w:pPr>
-            <w:hyperlink r:id="rId29">
+            <w:hyperlink r:id="rId32">
               <w:r>
                 <w:rPr>
                   <w:rStyle w:val="Hyperlink"/>
@@ -2535,7 +3208,7 @@
               <w:t xml:space="preserve"> </w:t>
             </w:r>
             <w:r>
-              <w:t xml:space="preserve">aufrufbar ist: 12 Projektionen, Actions,</w:t>
+              <w:t xml:space="preserve">aufrufbar ist: 13 Projektionen, Actions,</w:t>
             </w:r>
             <w:r>
               <w:t xml:space="preserve"> </w:t>
@@ -2640,7 +3313,7 @@
               <w:pStyle w:val="Compact"/>
               <w:jc w:val="left"/>
             </w:pPr>
-            <w:hyperlink r:id="rId30">
+            <w:hyperlink r:id="rId33">
               <w:r>
                 <w:rPr>
                   <w:rStyle w:val="Hyperlink"/>
@@ -2654,7 +3327,7 @@
             <w:r>
               <w:t xml:space="preserve"> </w:t>
             </w:r>
-            <w:hyperlink r:id="rId31">
+            <w:hyperlink r:id="rId34">
               <w:r>
                 <w:rPr>
                   <w:rStyle w:val="Hyperlink"/>
@@ -2682,7 +3355,7 @@
               <w:jc w:val="left"/>
             </w:pPr>
             <w:r>
-              <w:t xml:space="preserve">Rolle + Mandant aus DB, Tenant-Filter —</w:t>
+              <w:t xml:space="preserve">Rolle + Mandant aus DB (Tenant aus Users/Org in den Token injiziert), Tenant-Filter —</w:t>
             </w:r>
             <w:r>
               <w:t xml:space="preserve"> </w:t>
@@ -2725,7 +3398,7 @@
               <w:pStyle w:val="Compact"/>
               <w:jc w:val="left"/>
             </w:pPr>
-            <w:hyperlink r:id="rId32">
+            <w:hyperlink r:id="rId35">
               <w:r>
                 <w:rPr>
                   <w:rStyle w:val="Hyperlink"/>
@@ -2807,7 +3480,7 @@
               <w:pStyle w:val="Compact"/>
               <w:jc w:val="left"/>
             </w:pPr>
-            <w:hyperlink r:id="rId33">
+            <w:hyperlink r:id="rId36">
               <w:r>
                 <w:rPr>
                   <w:rStyle w:val="Hyperlink"/>
@@ -2838,7 +3511,7 @@
               <w:jc w:val="left"/>
             </w:pPr>
             <w:r>
-              <w:t xml:space="preserve">Defaults, Lifecycle-Automat, BOM-Check, Consumer-DTO</w:t>
+              <w:t xml:space="preserve">Defaults, Lifecycle-Automat, BOM-Check, Per-Charge-Sourcing, Consumer-DTO (mit Storytelling, Variant-Bild, real verbautem Komponenten-Pass)</w:t>
             </w:r>
           </w:p>
         </w:tc>
@@ -2865,7 +3538,7 @@
               <w:pStyle w:val="Compact"/>
               <w:jc w:val="left"/>
             </w:pPr>
-            <w:hyperlink r:id="rId34">
+            <w:hyperlink r:id="rId37">
               <w:r>
                 <w:rPr>
                   <w:rStyle w:val="Hyperlink"/>
@@ -2896,7 +3569,7 @@
               <w:jc w:val="left"/>
             </w:pPr>
             <w:r>
-              <w:t xml:space="preserve">HMAC-Token, Secret-Loader, hierarchische Aggregation</w:t>
+              <w:t xml:space="preserve">HMAC-Token, Secret-Loader, hierarchische Aggregation mit Per-Charge-Mittelung</w:t>
             </w:r>
           </w:p>
         </w:tc>
@@ -2923,7 +3596,7 @@
               <w:pStyle w:val="Compact"/>
               <w:jc w:val="left"/>
             </w:pPr>
-            <w:hyperlink r:id="rId35">
+            <w:hyperlink r:id="rId38">
               <w:r>
                 <w:rPr>
                   <w:rStyle w:val="Hyperlink"/>
@@ -2958,1248 +3631,13 @@
               <w:jc w:val="left"/>
             </w:pPr>
             <w:r>
-              <w:t xml:space="preserve">Schema + SQL-Queries automatisch aus dem Modell</w:t>
+              <w:t xml:space="preserve">Schema + SQL-Queries automatisch aus dem Modell (13 Entitäten)</w:t>
             </w:r>
           </w:p>
         </w:tc>
       </w:tr>
     </w:tbl>
-    <w:bookmarkStart w:id="36" w:name="präzisierungen-1"/>
-    <w:p>
-      <w:pPr>
-        <w:pStyle w:val="Heading3"/>
-      </w:pPr>
-      <w:r>
-        <w:t xml:space="preserve">Präzisierungen</w:t>
-      </w:r>
-    </w:p>
-    <w:p>
-      <w:pPr>
-        <w:numPr>
-          <w:ilvl w:val="0"/>
-          <w:numId w:val="1002"/>
-        </w:numPr>
-        <w:pStyle w:val="Compact"/>
-      </w:pPr>
-      <w:r>
-        <w:rPr>
-          <w:bCs/>
-          <w:b/>
-        </w:rPr>
-        <w:t xml:space="preserve">Reihenfolge ist Teil des Frameworks:</w:t>
-      </w:r>
-      <w:r>
-        <w:t xml:space="preserve"> </w:t>
-      </w:r>
-      <w:r>
-        <w:t xml:space="preserve">CAP arbeitet jede Anfrage in Phasen</w:t>
-      </w:r>
-      <w:r>
-        <w:t xml:space="preserve"> </w:t>
-      </w:r>
-      <w:r>
-        <w:rPr>
-          <w:rStyle w:val="VerbatimChar"/>
-        </w:rPr>
-        <w:t xml:space="preserve">before → on → after</w:t>
-      </w:r>
-      <w:r>
-        <w:t xml:space="preserve"> </w:t>
-      </w:r>
-      <w:r>
-        <w:t xml:space="preserve">ab. Die Guards sind</w:t>
-      </w:r>
-      <w:r>
-        <w:t xml:space="preserve"> </w:t>
-      </w:r>
-      <w:r>
-        <w:rPr>
-          <w:rStyle w:val="VerbatimChar"/>
-        </w:rPr>
-        <w:t xml:space="preserve">before</w:t>
-      </w:r>
-      <w:r>
-        <w:t xml:space="preserve">, die Lifecycle-Logik ist</w:t>
-      </w:r>
-      <w:r>
-        <w:t xml:space="preserve"> </w:t>
-      </w:r>
-      <w:r>
-        <w:rPr>
-          <w:rStyle w:val="VerbatimChar"/>
-        </w:rPr>
-        <w:t xml:space="preserve">on</w:t>
-      </w:r>
-      <w:r>
-        <w:t xml:space="preserve">. Der Türsteher läuft also</w:t>
-      </w:r>
-      <w:r>
-        <w:t xml:space="preserve"> </w:t>
-      </w:r>
-      <w:r>
-        <w:rPr>
-          <w:bCs/>
-          <w:b/>
-        </w:rPr>
-        <w:t xml:space="preserve">garantiert vor</w:t>
-      </w:r>
-      <w:r>
-        <w:t xml:space="preserve"> </w:t>
-      </w:r>
-      <w:r>
-        <w:t xml:space="preserve">der Business-Logik.</w:t>
-      </w:r>
-    </w:p>
-    <w:p>
-      <w:pPr>
-        <w:numPr>
-          <w:ilvl w:val="0"/>
-          <w:numId w:val="1002"/>
-        </w:numPr>
-        <w:pStyle w:val="Compact"/>
-      </w:pPr>
-      <w:r>
-        <w:rPr>
-          <w:bCs/>
-          <w:b/>
-        </w:rPr>
-        <w:t xml:space="preserve">Arbeitsteilung Framework ↔ eigener Code:</w:t>
-      </w:r>
-      <w:r>
-        <w:t xml:space="preserve"> </w:t>
-      </w:r>
-      <w:r>
-        <w:t xml:space="preserve">CAP generiert</w:t>
-      </w:r>
-      <w:r>
-        <w:t xml:space="preserve"> </w:t>
-      </w:r>
-      <w:r>
-        <w:rPr>
-          <w:bCs/>
-          <w:b/>
-        </w:rPr>
-        <w:t xml:space="preserve">CRUD + Schema</w:t>
-      </w:r>
-      <w:r>
-        <w:t xml:space="preserve"> </w:t>
-      </w:r>
-      <w:r>
-        <w:t xml:space="preserve">aus dem Modell; alles Fachliche (Guards, Lifecycle, Aggregation, Consumer-DTO) ist</w:t>
-      </w:r>
-      <w:r>
-        <w:t xml:space="preserve"> </w:t>
-      </w:r>
-      <w:r>
-        <w:rPr>
-          <w:bCs/>
-          <w:b/>
-        </w:rPr>
-        <w:t xml:space="preserve">selbst geschrieben</w:t>
-      </w:r>
-      <w:r>
-        <w:t xml:space="preserve">.</w:t>
-      </w:r>
-    </w:p>
-    <w:p>
-      <w:pPr>
-        <w:numPr>
-          <w:ilvl w:val="0"/>
-          <w:numId w:val="1002"/>
-        </w:numPr>
-        <w:pStyle w:val="Compact"/>
-      </w:pPr>
-      <w:r>
-        <w:rPr>
-          <w:bCs/>
-          <w:b/>
-        </w:rPr>
-        <w:t xml:space="preserve">Deployment-agnostisch:</w:t>
-      </w:r>
-      <w:r>
-        <w:t xml:space="preserve"> </w:t>
-      </w:r>
-      <w:r>
-        <w:t xml:space="preserve">diese Sicht stimmt auch lokal (SQLite + Mock-Auth) — nur die Platform boundary wechselt.</w:t>
-      </w:r>
-    </w:p>
-    <w:bookmarkEnd w:id="36"/>
-    <w:bookmarkStart w:id="37" w:name="sprech-satz-1"/>
-    <w:p>
-      <w:pPr>
-        <w:pStyle w:val="Heading3"/>
-      </w:pPr>
-      <w:r>
-        <w:t xml:space="preserve">Sprech-Satz</w:t>
-      </w:r>
-    </w:p>
-    <w:p>
-      <w:pPr>
-        <w:pStyle w:val="BlockText"/>
-      </w:pPr>
-      <w:r>
-        <w:t xml:space="preserve">„Die Software-Architektur ist sechs Schichten von oben nach unten: Client, Platform boundary, API, Business Logic, Libs, Persistence.</w:t>
-      </w:r>
-      <w:r>
-        <w:t xml:space="preserve"> </w:t>
-      </w:r>
-      <w:r>
-        <w:rPr>
-          <w:bCs/>
-          <w:b/>
-        </w:rPr>
-        <w:t xml:space="preserve">CAP generiert</w:t>
-      </w:r>
-      <w:r>
-        <w:t xml:space="preserve"> </w:t>
-      </w:r>
-      <w:r>
-        <w:t xml:space="preserve">das CRUD und das Schema aus dem Modell; alles Fachliche — die Guards, der Lifecycle-Automat und die Aggregation — ist</w:t>
-      </w:r>
-      <w:r>
-        <w:t xml:space="preserve"> </w:t>
-      </w:r>
-      <w:r>
-        <w:rPr>
-          <w:bCs/>
-          <w:b/>
-        </w:rPr>
-        <w:t xml:space="preserve">selbst geschrieben</w:t>
-      </w:r>
-      <w:r>
-        <w:t xml:space="preserve">. Der Türsteher resolved Rolle und Mandant aus der DB und läuft vor jeder Logik."</w:t>
-      </w:r>
-    </w:p>
-    <w:p>
-      <w:r>
-        <w:pict>
-          <v:rect style="width:0;height:1.5pt" o:hralign="center" o:hrstd="t" o:hr="t"/>
-        </w:pict>
-      </w:r>
-    </w:p>
-    <w:bookmarkEnd w:id="37"/>
-    <w:bookmarkEnd w:id="38"/>
-    <w:bookmarkStart w:id="42" w:name="btp-architektur"/>
-    <w:p>
-      <w:pPr>
-        <w:pStyle w:val="Heading2"/>
-      </w:pPr>
-      <w:r>
-        <w:t xml:space="preserve">3. BTP-Architektur</w:t>
-      </w:r>
-    </w:p>
-    <w:p>
-      <w:pPr>
-        <w:pStyle w:val="FirstParagraph"/>
-      </w:pPr>
-      <w:r>
-        <w:rPr>
-          <w:iCs/>
-          <w:i/>
-        </w:rPr>
-        <w:t xml:space="preserve">Sicht: WO es läuft. Alles steckt im Subaccount (eu10-004) · CF Org · Space</w:t>
-      </w:r>
-      <w:r>
-        <w:rPr>
-          <w:iCs/>
-          <w:i/>
-        </w:rPr>
-        <w:t xml:space="preserve"> </w:t>
-      </w:r>
-      <w:r>
-        <w:rPr>
-          <w:rStyle w:val="VerbatimChar"/>
-          <w:iCs/>
-          <w:i/>
-        </w:rPr>
-        <w:t xml:space="preserve">dev</w:t>
-      </w:r>
-      <w:r>
-        <w:rPr>
-          <w:iCs/>
-          <w:i/>
-        </w:rPr>
-        <w:t xml:space="preserve">.</w:t>
-      </w:r>
-    </w:p>
-    <w:p>
-      <w:pPr>
-        <w:pStyle w:val="BodyText"/>
-      </w:pPr>
-      <w:r>
-        <w:t xml:space="preserve">Zentrale Unterscheidung:</w:t>
-      </w:r>
-      <w:r>
-        <w:t xml:space="preserve"> </w:t>
-      </w:r>
-      <w:r>
-        <w:rPr>
-          <w:bCs/>
-          <w:b/>
-        </w:rPr>
-        <w:t xml:space="preserve">Modul</w:t>
-      </w:r>
-      <w:r>
-        <w:t xml:space="preserve"> </w:t>
-      </w:r>
-      <w:r>
-        <w:t xml:space="preserve">= wird deployt und</w:t>
-      </w:r>
-      <w:r>
-        <w:t xml:space="preserve"> </w:t>
-      </w:r>
-      <w:r>
-        <w:rPr>
-          <w:iCs/>
-          <w:i/>
-        </w:rPr>
-        <w:t xml:space="preserve">läuft</w:t>
-      </w:r>
-      <w:r>
-        <w:t xml:space="preserve"> </w:t>
-      </w:r>
-      <w:r>
-        <w:t xml:space="preserve">·</w:t>
-      </w:r>
-      <w:r>
-        <w:t xml:space="preserve"> </w:t>
-      </w:r>
-      <w:r>
-        <w:rPr>
-          <w:bCs/>
-          <w:b/>
-        </w:rPr>
-        <w:t xml:space="preserve">Resource</w:t>
-      </w:r>
-      <w:r>
-        <w:t xml:space="preserve"> </w:t>
-      </w:r>
-      <w:r>
-        <w:t xml:space="preserve">= gebuchter Plattformdienst, an den Module per</w:t>
-      </w:r>
-      <w:r>
-        <w:t xml:space="preserve"> </w:t>
-      </w:r>
-      <w:r>
-        <w:rPr>
-          <w:iCs/>
-          <w:i/>
-        </w:rPr>
-        <w:t xml:space="preserve">Binding</w:t>
-      </w:r>
-      <w:r>
-        <w:t xml:space="preserve"> </w:t>
-      </w:r>
-      <w:r>
-        <w:t xml:space="preserve">andocken.</w:t>
-      </w:r>
-    </w:p>
-    <w:tbl>
-      <w:tblPr>
-        <w:tblStyle w:val="Table"/>
-        <w:tblW w:type="pct" w:w="5000.0"/>
-        <w:tblLook w:firstRow="1" w:lastRow="0" w:firstColumn="0" w:lastColumn="0" w:noHBand="0" w:noVBand="0" w:val="0020"/>
-      </w:tblPr>
-      <w:tblGrid>
-        <w:gridCol w:w="1584"/>
-        <w:gridCol w:w="1584"/>
-        <w:gridCol w:w="1584"/>
-        <w:gridCol w:w="1584"/>
-        <w:gridCol w:w="1584"/>
-      </w:tblGrid>
-      <w:tr>
-        <w:tc>
-          <w:p>
-            <w:pPr>
-              <w:pStyle w:val="Compact"/>
-              <w:jc w:val="left"/>
-            </w:pPr>
-            <w:r>
-              <w:t xml:space="preserve">Rolle</w:t>
-            </w:r>
-          </w:p>
-        </w:tc>
-        <w:tc>
-          <w:p>
-            <w:pPr>
-              <w:pStyle w:val="Compact"/>
-              <w:jc w:val="left"/>
-            </w:pPr>
-            <w:r>
-              <w:t xml:space="preserve">Komponente</w:t>
-            </w:r>
-          </w:p>
-        </w:tc>
-        <w:tc>
-          <w:p>
-            <w:pPr>
-              <w:pStyle w:val="Compact"/>
-              <w:jc w:val="left"/>
-            </w:pPr>
-            <w:r>
-              <w:t xml:space="preserve">MTA-Typ</w:t>
-            </w:r>
-          </w:p>
-        </w:tc>
-        <w:tc>
-          <w:p>
-            <w:pPr>
-              <w:pStyle w:val="Compact"/>
-              <w:jc w:val="left"/>
-            </w:pPr>
-            <w:r>
-              <w:t xml:space="preserve">Backend/Frontend</w:t>
-            </w:r>
-          </w:p>
-        </w:tc>
-        <w:tc>
-          <w:p>
-            <w:pPr>
-              <w:pStyle w:val="Compact"/>
-              <w:jc w:val="left"/>
-            </w:pPr>
-            <w:r>
-              <w:t xml:space="preserve">Aufgabe</w:t>
-            </w:r>
-          </w:p>
-        </w:tc>
-      </w:tr>
-      <w:tr>
-        <w:tc>
-          <w:p>
-            <w:pPr>
-              <w:pStyle w:val="Compact"/>
-              <w:jc w:val="left"/>
-            </w:pPr>
-            <w:r>
-              <w:rPr>
-                <w:bCs/>
-                <w:b/>
-              </w:rPr>
-              <w:t xml:space="preserve">Einstieg / Routing</w:t>
-            </w:r>
-          </w:p>
-        </w:tc>
-        <w:tc>
-          <w:p>
-            <w:pPr>
-              <w:pStyle w:val="Compact"/>
-              <w:jc w:val="left"/>
-            </w:pPr>
-            <w:r>
-              <w:t xml:space="preserve">dpp-approuter</w:t>
-            </w:r>
-          </w:p>
-        </w:tc>
-        <w:tc>
-          <w:p>
-            <w:pPr>
-              <w:pStyle w:val="Compact"/>
-              <w:jc w:val="left"/>
-            </w:pPr>
-            <w:r>
-              <w:rPr>
-                <w:bCs/>
-                <w:b/>
-              </w:rPr>
-              <w:t xml:space="preserve">Modul</w:t>
-            </w:r>
-            <w:r>
-              <w:t xml:space="preserve"> </w:t>
-            </w:r>
-            <w:r>
-              <w:t xml:space="preserve">(</w:t>
-            </w:r>
-            <w:r>
-              <w:rPr>
-                <w:rStyle w:val="VerbatimChar"/>
-              </w:rPr>
-              <w:t xml:space="preserve">approuter.nodejs</w:t>
-            </w:r>
-            <w:r>
-              <w:t xml:space="preserve">)</w:t>
-            </w:r>
-          </w:p>
-        </w:tc>
-        <w:tc>
-          <w:p>
-            <w:pPr>
-              <w:pStyle w:val="Compact"/>
-              <w:jc w:val="left"/>
-            </w:pPr>
-            <w:r>
-              <w:t xml:space="preserve">Backend</w:t>
-            </w:r>
-          </w:p>
-        </w:tc>
-        <w:tc>
-          <w:p>
-            <w:pPr>
-              <w:pStyle w:val="Compact"/>
-              <w:jc w:val="left"/>
-            </w:pPr>
-            <w:r>
-              <w:t xml:space="preserve">öffentliche Tür, leitet API mit JWT weiter</w:t>
-            </w:r>
-          </w:p>
-        </w:tc>
-      </w:tr>
-      <w:tr>
-        <w:tc>
-          <w:p>
-            <w:pPr>
-              <w:pStyle w:val="Compact"/>
-              <w:jc w:val="left"/>
-            </w:pPr>
-            <w:r>
-              <w:rPr>
-                <w:bCs/>
-                <w:b/>
-              </w:rPr>
-              <w:t xml:space="preserve">App-Laufzeit</w:t>
-            </w:r>
-          </w:p>
-        </w:tc>
-        <w:tc>
-          <w:p>
-            <w:pPr>
-              <w:pStyle w:val="Compact"/>
-              <w:jc w:val="left"/>
-            </w:pPr>
-            <w:r>
-              <w:t xml:space="preserve">dpp-srv</w:t>
-            </w:r>
-          </w:p>
-        </w:tc>
-        <w:tc>
-          <w:p>
-            <w:pPr>
-              <w:pStyle w:val="Compact"/>
-              <w:jc w:val="left"/>
-            </w:pPr>
-            <w:r>
-              <w:rPr>
-                <w:bCs/>
-                <w:b/>
-              </w:rPr>
-              <w:t xml:space="preserve">Modul</w:t>
-            </w:r>
-            <w:r>
-              <w:t xml:space="preserve"> </w:t>
-            </w:r>
-            <w:r>
-              <w:t xml:space="preserve">(</w:t>
-            </w:r>
-            <w:r>
-              <w:rPr>
-                <w:rStyle w:val="VerbatimChar"/>
-              </w:rPr>
-              <w:t xml:space="preserve">nodejs</w:t>
-            </w:r>
-            <w:r>
-              <w:t xml:space="preserve">)</w:t>
-            </w:r>
-          </w:p>
-        </w:tc>
-        <w:tc>
-          <w:p>
-            <w:pPr>
-              <w:pStyle w:val="Compact"/>
-              <w:jc w:val="left"/>
-            </w:pPr>
-            <w:r>
-              <w:t xml:space="preserve">Backend</w:t>
-            </w:r>
-          </w:p>
-        </w:tc>
-        <w:tc>
-          <w:p>
-            <w:pPr>
-              <w:pStyle w:val="Compact"/>
-              <w:jc w:val="left"/>
-            </w:pPr>
-            <w:r>
-              <w:t xml:space="preserve">der laufende CAP-Service</w:t>
-            </w:r>
-          </w:p>
-        </w:tc>
-      </w:tr>
-      <w:tr>
-        <w:tc>
-          <w:p>
-            <w:pPr>
-              <w:pStyle w:val="Compact"/>
-              <w:jc w:val="left"/>
-            </w:pPr>
-            <w:r>
-              <w:rPr>
-                <w:bCs/>
-                <w:b/>
-              </w:rPr>
-              <w:t xml:space="preserve">Schema-Deploy</w:t>
-            </w:r>
-          </w:p>
-        </w:tc>
-        <w:tc>
-          <w:p>
-            <w:pPr>
-              <w:pStyle w:val="Compact"/>
-              <w:jc w:val="left"/>
-            </w:pPr>
-            <w:r>
-              <w:t xml:space="preserve">dpp-db-deployer</w:t>
-            </w:r>
-          </w:p>
-        </w:tc>
-        <w:tc>
-          <w:p>
-            <w:pPr>
-              <w:pStyle w:val="Compact"/>
-              <w:jc w:val="left"/>
-            </w:pPr>
-            <w:r>
-              <w:rPr>
-                <w:bCs/>
-                <w:b/>
-              </w:rPr>
-              <w:t xml:space="preserve">Modul</w:t>
-            </w:r>
-            <w:r>
-              <w:t xml:space="preserve"> </w:t>
-            </w:r>
-            <w:r>
-              <w:t xml:space="preserve">(</w:t>
-            </w:r>
-            <w:r>
-              <w:rPr>
-                <w:rStyle w:val="VerbatimChar"/>
-              </w:rPr>
-              <w:t xml:space="preserve">hdb</w:t>
-            </w:r>
-            <w:r>
-              <w:t xml:space="preserve">)</w:t>
-            </w:r>
-          </w:p>
-        </w:tc>
-        <w:tc>
-          <w:p>
-            <w:pPr>
-              <w:pStyle w:val="Compact"/>
-              <w:jc w:val="left"/>
-            </w:pPr>
-            <w:r>
-              <w:t xml:space="preserve">Backend</w:t>
-            </w:r>
-          </w:p>
-        </w:tc>
-        <w:tc>
-          <w:p>
-            <w:pPr>
-              <w:pStyle w:val="Compact"/>
-              <w:jc w:val="left"/>
-            </w:pPr>
-            <w:r>
-              <w:t xml:space="preserve">erzeugt das HANA-Schema, läuft einmal, beendet sich</w:t>
-            </w:r>
-          </w:p>
-        </w:tc>
-      </w:tr>
-      <w:tr>
-        <w:tc>
-          <w:p>
-            <w:pPr>
-              <w:pStyle w:val="Compact"/>
-              <w:jc w:val="left"/>
-            </w:pPr>
-            <w:r>
-              <w:rPr>
-                <w:bCs/>
-                <w:b/>
-              </w:rPr>
-              <w:t xml:space="preserve">SPA-Auslieferung</w:t>
-            </w:r>
-          </w:p>
-        </w:tc>
-        <w:tc>
-          <w:p>
-            <w:pPr>
-              <w:pStyle w:val="Compact"/>
-              <w:jc w:val="left"/>
-            </w:pPr>
-            <w:r>
-              <w:t xml:space="preserve">dpp-approuter (FE)</w:t>
-            </w:r>
-          </w:p>
-        </w:tc>
-        <w:tc>
-          <w:p>
-            <w:pPr>
-              <w:pStyle w:val="Compact"/>
-              <w:jc w:val="left"/>
-            </w:pPr>
-            <w:r>
-              <w:rPr>
-                <w:bCs/>
-                <w:b/>
-              </w:rPr>
-              <w:t xml:space="preserve">Modul</w:t>
-            </w:r>
-            <w:r>
-              <w:t xml:space="preserve"> </w:t>
-            </w:r>
-            <w:r>
-              <w:t xml:space="preserve">(</w:t>
-            </w:r>
-            <w:r>
-              <w:rPr>
-                <w:rStyle w:val="VerbatimChar"/>
-              </w:rPr>
-              <w:t xml:space="preserve">approuter.nodejs</w:t>
-            </w:r>
-            <w:r>
-              <w:t xml:space="preserve">)</w:t>
-            </w:r>
-          </w:p>
-        </w:tc>
-        <w:tc>
-          <w:p>
-            <w:pPr>
-              <w:pStyle w:val="Compact"/>
-              <w:jc w:val="left"/>
-            </w:pPr>
-            <w:r>
-              <w:t xml:space="preserve">Frontend</w:t>
-            </w:r>
-          </w:p>
-        </w:tc>
-        <w:tc>
-          <w:p>
-            <w:pPr>
-              <w:pStyle w:val="Compact"/>
-              <w:jc w:val="left"/>
-            </w:pPr>
-            <w:r>
-              <w:t xml:space="preserve">serviert die SPA, leitet</w:t>
-            </w:r>
-            <w:r>
-              <w:t xml:space="preserve"> </w:t>
-            </w:r>
-            <w:r>
-              <w:rPr>
-                <w:rStyle w:val="VerbatimChar"/>
-              </w:rPr>
-              <w:t xml:space="preserve">/odata</w:t>
-            </w:r>
-            <w:r>
-              <w:t xml:space="preserve">,</w:t>
-            </w:r>
-            <w:r>
-              <w:rPr>
-                <w:rStyle w:val="VerbatimChar"/>
-              </w:rPr>
-              <w:t xml:space="preserve">/public</w:t>
-            </w:r>
-            <w:r>
-              <w:t xml:space="preserve"> </w:t>
-            </w:r>
-            <w:r>
-              <w:t xml:space="preserve">weiter</w:t>
-            </w:r>
-          </w:p>
-        </w:tc>
-      </w:tr>
-      <w:tr>
-        <w:tc>
-          <w:p>
-            <w:pPr>
-              <w:pStyle w:val="Compact"/>
-              <w:jc w:val="left"/>
-            </w:pPr>
-            <w:r>
-              <w:rPr>
-                <w:bCs/>
-                <w:b/>
-              </w:rPr>
-              <w:t xml:space="preserve">UI-Build</w:t>
-            </w:r>
-          </w:p>
-        </w:tc>
-        <w:tc>
-          <w:p>
-            <w:pPr>
-              <w:pStyle w:val="Compact"/>
-              <w:jc w:val="left"/>
-            </w:pPr>
-            <w:r>
-              <w:t xml:space="preserve">dpp-ui</w:t>
-            </w:r>
-          </w:p>
-        </w:tc>
-        <w:tc>
-          <w:p>
-            <w:pPr>
-              <w:pStyle w:val="Compact"/>
-              <w:jc w:val="left"/>
-            </w:pPr>
-            <w:r>
-              <w:rPr>
-                <w:bCs/>
-                <w:b/>
-              </w:rPr>
-              <w:t xml:space="preserve">Modul</w:t>
-            </w:r>
-            <w:r>
-              <w:t xml:space="preserve"> </w:t>
-            </w:r>
-            <w:r>
-              <w:t xml:space="preserve">(</w:t>
-            </w:r>
-            <w:r>
-              <w:rPr>
-                <w:rStyle w:val="VerbatimChar"/>
-              </w:rPr>
-              <w:t xml:space="preserve">html5</w:t>
-            </w:r>
-            <w:r>
-              <w:t xml:space="preserve">)</w:t>
-            </w:r>
-          </w:p>
-        </w:tc>
-        <w:tc>
-          <w:p>
-            <w:pPr>
-              <w:pStyle w:val="Compact"/>
-              <w:jc w:val="left"/>
-            </w:pPr>
-            <w:r>
-              <w:t xml:space="preserve">Frontend</w:t>
-            </w:r>
-          </w:p>
-        </w:tc>
-        <w:tc>
-          <w:p>
-            <w:pPr>
-              <w:pStyle w:val="Compact"/>
-              <w:jc w:val="left"/>
-            </w:pPr>
-            <w:r>
-              <w:t xml:space="preserve">Vite-Build →</w:t>
-            </w:r>
-            <w:r>
-              <w:t xml:space="preserve"> </w:t>
-            </w:r>
-            <w:r>
-              <w:rPr>
-                <w:rStyle w:val="VerbatimChar"/>
-              </w:rPr>
-              <w:t xml:space="preserve">dist</w:t>
-            </w:r>
-          </w:p>
-        </w:tc>
-      </w:tr>
-      <w:tr>
-        <w:tc>
-          <w:p>
-            <w:pPr>
-              <w:pStyle w:val="Compact"/>
-              <w:jc w:val="left"/>
-            </w:pPr>
-            <w:r>
-              <w:rPr>
-                <w:bCs/>
-                <w:b/>
-              </w:rPr>
-              <w:t xml:space="preserve">UI-Upload</w:t>
-            </w:r>
-          </w:p>
-        </w:tc>
-        <w:tc>
-          <w:p>
-            <w:pPr>
-              <w:pStyle w:val="Compact"/>
-              <w:jc w:val="left"/>
-            </w:pPr>
-            <w:r>
-              <w:t xml:space="preserve">dpp-ui-deployer</w:t>
-            </w:r>
-          </w:p>
-        </w:tc>
-        <w:tc>
-          <w:p>
-            <w:pPr>
-              <w:pStyle w:val="Compact"/>
-              <w:jc w:val="left"/>
-            </w:pPr>
-            <w:r>
-              <w:rPr>
-                <w:bCs/>
-                <w:b/>
-              </w:rPr>
-              <w:t xml:space="preserve">Modul</w:t>
-            </w:r>
-            <w:r>
-              <w:t xml:space="preserve"> </w:t>
-            </w:r>
-            <w:r>
-              <w:t xml:space="preserve">(</w:t>
-            </w:r>
-            <w:r>
-              <w:rPr>
-                <w:rStyle w:val="VerbatimChar"/>
-              </w:rPr>
-              <w:t xml:space="preserve">application.content</w:t>
-            </w:r>
-            <w:r>
-              <w:t xml:space="preserve">)</w:t>
-            </w:r>
-          </w:p>
-        </w:tc>
-        <w:tc>
-          <w:p>
-            <w:pPr>
-              <w:pStyle w:val="Compact"/>
-              <w:jc w:val="left"/>
-            </w:pPr>
-            <w:r>
-              <w:t xml:space="preserve">Frontend</w:t>
-            </w:r>
-          </w:p>
-        </w:tc>
-        <w:tc>
-          <w:p>
-            <w:pPr>
-              <w:pStyle w:val="Compact"/>
-              <w:jc w:val="left"/>
-            </w:pPr>
-            <w:r>
-              <w:t xml:space="preserve">lädt die gebaute UI ins HTML5-Repo</w:t>
-            </w:r>
-          </w:p>
-        </w:tc>
-      </w:tr>
-      <w:tr>
-        <w:tc>
-          <w:p>
-            <w:pPr>
-              <w:pStyle w:val="Compact"/>
-              <w:jc w:val="left"/>
-            </w:pPr>
-            <w:r>
-              <w:rPr>
-                <w:bCs/>
-                <w:b/>
-              </w:rPr>
-              <w:t xml:space="preserve">Datenbank</w:t>
-            </w:r>
-          </w:p>
-        </w:tc>
-        <w:tc>
-          <w:p>
-            <w:pPr>
-              <w:pStyle w:val="Compact"/>
-              <w:jc w:val="left"/>
-            </w:pPr>
-            <w:r>
-              <w:t xml:space="preserve">dpp-db</w:t>
-            </w:r>
-          </w:p>
-        </w:tc>
-        <w:tc>
-          <w:p>
-            <w:pPr>
-              <w:pStyle w:val="Compact"/>
-              <w:jc w:val="left"/>
-            </w:pPr>
-            <w:r>
-              <w:rPr>
-                <w:bCs/>
-                <w:b/>
-              </w:rPr>
-              <w:t xml:space="preserve">Resource</w:t>
-            </w:r>
-            <w:r>
-              <w:t xml:space="preserve"> </w:t>
-            </w:r>
-            <w:r>
-              <w:t xml:space="preserve">(HANA HDI,</w:t>
-            </w:r>
-            <w:r>
-              <w:t xml:space="preserve"> </w:t>
-            </w:r>
-            <w:r>
-              <w:rPr>
-                <w:rStyle w:val="VerbatimChar"/>
-              </w:rPr>
-              <w:t xml:space="preserve">hdi-shared</w:t>
-            </w:r>
-            <w:r>
-              <w:t xml:space="preserve">)</w:t>
-            </w:r>
-          </w:p>
-        </w:tc>
-        <w:tc>
-          <w:p>
-            <w:pPr>
-              <w:pStyle w:val="Compact"/>
-              <w:jc w:val="left"/>
-            </w:pPr>
-            <w:r>
-              <w:t xml:space="preserve">geteilt</w:t>
-            </w:r>
-          </w:p>
-        </w:tc>
-        <w:tc>
-          <w:p>
-            <w:pPr>
-              <w:pStyle w:val="Compact"/>
-              <w:jc w:val="left"/>
-            </w:pPr>
-            <w:r>
-              <w:t xml:space="preserve">speichert die 12 Tabellen</w:t>
-            </w:r>
-          </w:p>
-        </w:tc>
-      </w:tr>
-      <w:tr>
-        <w:tc>
-          <w:p>
-            <w:pPr>
-              <w:pStyle w:val="Compact"/>
-              <w:jc w:val="left"/>
-            </w:pPr>
-            <w:r>
-              <w:rPr>
-                <w:bCs/>
-                <w:b/>
-              </w:rPr>
-              <w:t xml:space="preserve">Identität</w:t>
-            </w:r>
-          </w:p>
-        </w:tc>
-        <w:tc>
-          <w:p>
-            <w:pPr>
-              <w:pStyle w:val="Compact"/>
-              <w:jc w:val="left"/>
-            </w:pPr>
-            <w:r>
-              <w:t xml:space="preserve">dpp-uaa</w:t>
-            </w:r>
-          </w:p>
-        </w:tc>
-        <w:tc>
-          <w:p>
-            <w:pPr>
-              <w:pStyle w:val="Compact"/>
-              <w:jc w:val="left"/>
-            </w:pPr>
-            <w:r>
-              <w:rPr>
-                <w:bCs/>
-                <w:b/>
-              </w:rPr>
-              <w:t xml:space="preserve">Resource</w:t>
-            </w:r>
-            <w:r>
-              <w:t xml:space="preserve"> </w:t>
-            </w:r>
-            <w:r>
-              <w:t xml:space="preserve">(XSUAA,</w:t>
-            </w:r>
-            <w:r>
-              <w:t xml:space="preserve"> </w:t>
-            </w:r>
-            <w:r>
-              <w:rPr>
-                <w:rStyle w:val="VerbatimChar"/>
-              </w:rPr>
-              <w:t xml:space="preserve">application</w:t>
-            </w:r>
-            <w:r>
-              <w:t xml:space="preserve">)</w:t>
-            </w:r>
-          </w:p>
-        </w:tc>
-        <w:tc>
-          <w:p>
-            <w:pPr>
-              <w:pStyle w:val="Compact"/>
-              <w:jc w:val="left"/>
-            </w:pPr>
-            <w:r>
-              <w:rPr>
-                <w:bCs/>
-                <w:b/>
-              </w:rPr>
-              <w:t xml:space="preserve">von beiden MTAs geteilt</w:t>
-            </w:r>
-          </w:p>
-        </w:tc>
-        <w:tc>
-          <w:p>
-            <w:pPr>
-              <w:pStyle w:val="Compact"/>
-              <w:jc w:val="left"/>
-            </w:pPr>
-            <w:r>
-              <w:t xml:space="preserve">stellt Tokens aus / prüft sie</w:t>
-            </w:r>
-          </w:p>
-        </w:tc>
-      </w:tr>
-      <w:tr>
-        <w:tc>
-          <w:p>
-            <w:pPr>
-              <w:pStyle w:val="Compact"/>
-              <w:jc w:val="left"/>
-            </w:pPr>
-            <w:r>
-              <w:rPr>
-                <w:bCs/>
-                <w:b/>
-              </w:rPr>
-              <w:t xml:space="preserve">Geheimnisse</w:t>
-            </w:r>
-          </w:p>
-        </w:tc>
-        <w:tc>
-          <w:p>
-            <w:pPr>
-              <w:pStyle w:val="Compact"/>
-              <w:jc w:val="left"/>
-            </w:pPr>
-            <w:r>
-              <w:t xml:space="preserve">dpp-secrets</w:t>
-            </w:r>
-          </w:p>
-        </w:tc>
-        <w:tc>
-          <w:p>
-            <w:pPr>
-              <w:pStyle w:val="Compact"/>
-              <w:jc w:val="left"/>
-            </w:pPr>
-            <w:r>
-              <w:rPr>
-                <w:bCs/>
-                <w:b/>
-              </w:rPr>
-              <w:t xml:space="preserve">Resource</w:t>
-            </w:r>
-            <w:r>
-              <w:t xml:space="preserve"> </w:t>
-            </w:r>
-            <w:r>
-              <w:t xml:space="preserve">(user-provided, vorab angelegt)</w:t>
-            </w:r>
-          </w:p>
-        </w:tc>
-        <w:tc>
-          <w:p>
-            <w:pPr>
-              <w:pStyle w:val="Compact"/>
-              <w:jc w:val="left"/>
-            </w:pPr>
-            <w:r>
-              <w:t xml:space="preserve">Backend</w:t>
-            </w:r>
-          </w:p>
-        </w:tc>
-        <w:tc>
-          <w:p>
-            <w:pPr>
-              <w:pStyle w:val="Compact"/>
-              <w:jc w:val="left"/>
-            </w:pPr>
-            <w:r>
-              <w:t xml:space="preserve">HMAC-Key + Public Base URL</w:t>
-            </w:r>
-          </w:p>
-        </w:tc>
-      </w:tr>
-      <w:tr>
-        <w:tc>
-          <w:p>
-            <w:pPr>
-              <w:pStyle w:val="Compact"/>
-              <w:jc w:val="left"/>
-            </w:pPr>
-            <w:r>
-              <w:rPr>
-                <w:bCs/>
-                <w:b/>
-              </w:rPr>
-              <w:t xml:space="preserve">UI-Hosting</w:t>
-            </w:r>
-          </w:p>
-        </w:tc>
-        <w:tc>
-          <w:p>
-            <w:pPr>
-              <w:pStyle w:val="Compact"/>
-              <w:jc w:val="left"/>
-            </w:pPr>
-            <w:r>
-              <w:t xml:space="preserve">dpp-html5-host / -runtime</w:t>
-            </w:r>
-          </w:p>
-        </w:tc>
-        <w:tc>
-          <w:p>
-            <w:pPr>
-              <w:pStyle w:val="Compact"/>
-              <w:jc w:val="left"/>
-            </w:pPr>
-            <w:r>
-              <w:rPr>
-                <w:bCs/>
-                <w:b/>
-              </w:rPr>
-              <w:t xml:space="preserve">Resource</w:t>
-            </w:r>
-            <w:r>
-              <w:t xml:space="preserve"> </w:t>
-            </w:r>
-            <w:r>
-              <w:t xml:space="preserve">(</w:t>
-            </w:r>
-            <w:r>
-              <w:rPr>
-                <w:rStyle w:val="VerbatimChar"/>
-              </w:rPr>
-              <w:t xml:space="preserve">html5-apps-repo</w:t>
-            </w:r>
-            <w:r>
-              <w:t xml:space="preserve">)</w:t>
-            </w:r>
-          </w:p>
-        </w:tc>
-        <w:tc>
-          <w:p>
-            <w:pPr>
-              <w:pStyle w:val="Compact"/>
-              <w:jc w:val="left"/>
-            </w:pPr>
-            <w:r>
-              <w:t xml:space="preserve">Frontend</w:t>
-            </w:r>
-          </w:p>
-        </w:tc>
-        <w:tc>
-          <w:p>
-            <w:pPr>
-              <w:pStyle w:val="Compact"/>
-              <w:jc w:val="left"/>
-            </w:pPr>
-            <w:r>
-              <w:t xml:space="preserve">speichert / serviert die UI</w:t>
-            </w:r>
-          </w:p>
-        </w:tc>
-      </w:tr>
-    </w:tbl>
-    <w:bookmarkStart w:id="40" w:name="präzisierungen-2"/>
+    <w:bookmarkStart w:id="39" w:name="präzisierungen-1"/>
     <w:p>
       <w:pPr>
         <w:pStyle w:val="Heading3"/>
@@ -4221,6 +3659,1331 @@
           <w:bCs/>
           <w:b/>
         </w:rPr>
+        <w:t xml:space="preserve">Reihenfolge ist Teil des Frameworks:</w:t>
+      </w:r>
+      <w:r>
+        <w:t xml:space="preserve"> </w:t>
+      </w:r>
+      <w:r>
+        <w:t xml:space="preserve">CAP arbeitet jede Anfrage in Phasen</w:t>
+      </w:r>
+      <w:r>
+        <w:t xml:space="preserve"> </w:t>
+      </w:r>
+      <w:r>
+        <w:rPr>
+          <w:rStyle w:val="VerbatimChar"/>
+        </w:rPr>
+        <w:t xml:space="preserve">before → on → after</w:t>
+      </w:r>
+      <w:r>
+        <w:t xml:space="preserve"> </w:t>
+      </w:r>
+      <w:r>
+        <w:t xml:space="preserve">ab. Die Guards sind</w:t>
+      </w:r>
+      <w:r>
+        <w:t xml:space="preserve"> </w:t>
+      </w:r>
+      <w:r>
+        <w:rPr>
+          <w:rStyle w:val="VerbatimChar"/>
+        </w:rPr>
+        <w:t xml:space="preserve">before</w:t>
+      </w:r>
+      <w:r>
+        <w:t xml:space="preserve">, die Lifecycle-Logik ist</w:t>
+      </w:r>
+      <w:r>
+        <w:t xml:space="preserve"> </w:t>
+      </w:r>
+      <w:r>
+        <w:rPr>
+          <w:rStyle w:val="VerbatimChar"/>
+        </w:rPr>
+        <w:t xml:space="preserve">on</w:t>
+      </w:r>
+      <w:r>
+        <w:t xml:space="preserve">. Der Türsteher läuft also</w:t>
+      </w:r>
+      <w:r>
+        <w:t xml:space="preserve"> </w:t>
+      </w:r>
+      <w:r>
+        <w:rPr>
+          <w:bCs/>
+          <w:b/>
+        </w:rPr>
+        <w:t xml:space="preserve">garantiert vor</w:t>
+      </w:r>
+      <w:r>
+        <w:t xml:space="preserve"> </w:t>
+      </w:r>
+      <w:r>
+        <w:t xml:space="preserve">der Business-Logik.</w:t>
+      </w:r>
+    </w:p>
+    <w:p>
+      <w:pPr>
+        <w:numPr>
+          <w:ilvl w:val="0"/>
+          <w:numId w:val="1003"/>
+        </w:numPr>
+        <w:pStyle w:val="Compact"/>
+      </w:pPr>
+      <w:r>
+        <w:rPr>
+          <w:bCs/>
+          <w:b/>
+        </w:rPr>
+        <w:t xml:space="preserve">Arbeitsteilung Framework ↔ eigener Code:</w:t>
+      </w:r>
+      <w:r>
+        <w:t xml:space="preserve"> </w:t>
+      </w:r>
+      <w:r>
+        <w:t xml:space="preserve">CAP generiert</w:t>
+      </w:r>
+      <w:r>
+        <w:t xml:space="preserve"> </w:t>
+      </w:r>
+      <w:r>
+        <w:rPr>
+          <w:bCs/>
+          <w:b/>
+        </w:rPr>
+        <w:t xml:space="preserve">CRUD + Schema</w:t>
+      </w:r>
+      <w:r>
+        <w:t xml:space="preserve"> </w:t>
+      </w:r>
+      <w:r>
+        <w:t xml:space="preserve">aus dem Modell; alles Fachliche (Guards, Lifecycle, Aggregation, Consumer-DTO) ist</w:t>
+      </w:r>
+      <w:r>
+        <w:t xml:space="preserve"> </w:t>
+      </w:r>
+      <w:r>
+        <w:rPr>
+          <w:bCs/>
+          <w:b/>
+        </w:rPr>
+        <w:t xml:space="preserve">selbst geschrieben</w:t>
+      </w:r>
+      <w:r>
+        <w:t xml:space="preserve">.</w:t>
+      </w:r>
+    </w:p>
+    <w:p>
+      <w:pPr>
+        <w:numPr>
+          <w:ilvl w:val="0"/>
+          <w:numId w:val="1003"/>
+        </w:numPr>
+        <w:pStyle w:val="Compact"/>
+      </w:pPr>
+      <w:r>
+        <w:rPr>
+          <w:bCs/>
+          <w:b/>
+        </w:rPr>
+        <w:t xml:space="preserve">Deployment-agnostisch:</w:t>
+      </w:r>
+      <w:r>
+        <w:t xml:space="preserve"> </w:t>
+      </w:r>
+      <w:r>
+        <w:t xml:space="preserve">diese Sicht stimmt auch lokal (SQLite + Mock-Auth) — nur die Platform boundary wechselt.</w:t>
+      </w:r>
+    </w:p>
+    <w:p>
+      <w:pPr>
+        <w:numPr>
+          <w:ilvl w:val="0"/>
+          <w:numId w:val="1003"/>
+        </w:numPr>
+        <w:pStyle w:val="Compact"/>
+      </w:pPr>
+      <w:r>
+        <w:rPr>
+          <w:bCs/>
+          <w:b/>
+        </w:rPr>
+        <w:t xml:space="preserve">Per-Charge-Sourcing &amp; Consumer-Einstieg:</w:t>
+      </w:r>
+      <w:r>
+        <w:t xml:space="preserve"> </w:t>
+      </w:r>
+      <w:r>
+        <w:t xml:space="preserve">Welche konkreten Komponenten-Chargen eine Produktionscharge verbraucht hat, hält</w:t>
+      </w:r>
+      <w:r>
+        <w:t xml:space="preserve"> </w:t>
+      </w:r>
+      <w:r>
+        <w:rPr>
+          <w:rStyle w:val="VerbatimChar"/>
+        </w:rPr>
+        <w:t xml:space="preserve">BatchComponents</w:t>
+      </w:r>
+      <w:r>
+        <w:t xml:space="preserve"> </w:t>
+      </w:r>
+      <w:r>
+        <w:t xml:space="preserve">fest — es überschreibt den Varianten-BOM-Standard, mehrere Chargen werden im Aggregator</w:t>
+      </w:r>
+      <w:r>
+        <w:t xml:space="preserve"> </w:t>
+      </w:r>
+      <w:r>
+        <w:rPr>
+          <w:bCs/>
+          <w:b/>
+        </w:rPr>
+        <w:t xml:space="preserve">gemittelt</w:t>
+      </w:r>
+      <w:r>
+        <w:t xml:space="preserve"> </w:t>
+      </w:r>
+      <w:r>
+        <w:t xml:space="preserve">(</w:t>
+      </w:r>
+      <w:r>
+        <w:rPr>
+          <w:rStyle w:val="VerbatimChar"/>
+        </w:rPr>
+        <w:t xml:space="preserve">firstItemDpp</w:t>
+      </w:r>
+      <w:r>
+        <w:t xml:space="preserve"> </w:t>
+      </w:r>
+      <w:r>
+        <w:t xml:space="preserve">löst den repräsentativen Pass einer Charge auf).</w:t>
+      </w:r>
+      <w:r>
+        <w:t xml:space="preserve"> </w:t>
+      </w:r>
+      <w:r>
+        <w:rPr>
+          <w:rStyle w:val="VerbatimChar"/>
+        </w:rPr>
+        <w:t xml:space="preserve">ProductBOMs</w:t>
+      </w:r>
+      <w:r>
+        <w:t xml:space="preserve"> </w:t>
+      </w:r>
+      <w:r>
+        <w:t xml:space="preserve">trägt zusätzlich Felder für</w:t>
+      </w:r>
+      <w:r>
+        <w:t xml:space="preserve"> </w:t>
+      </w:r>
+      <w:r>
+        <w:rPr>
+          <w:bCs/>
+          <w:b/>
+        </w:rPr>
+        <w:t xml:space="preserve">externe Komponenten</w:t>
+      </w:r>
+      <w:r>
+        <w:t xml:space="preserve"> </w:t>
+      </w:r>
+      <w:r>
+        <w:t xml:space="preserve">(frei eingetragene Werte ohne internes Produkt). Verbraucher erreichen den öffentlichen Pass auf zwei Wegen:</w:t>
+      </w:r>
+      <w:r>
+        <w:t xml:space="preserve"> </w:t>
+      </w:r>
+      <w:r>
+        <w:rPr>
+          <w:bCs/>
+          <w:b/>
+        </w:rPr>
+        <w:t xml:space="preserve">QR-Scan</w:t>
+      </w:r>
+      <w:r>
+        <w:t xml:space="preserve"> </w:t>
+      </w:r>
+      <w:r>
+        <w:t xml:space="preserve">→</w:t>
+      </w:r>
+      <w:r>
+        <w:t xml:space="preserve"> </w:t>
+      </w:r>
+      <w:r>
+        <w:rPr>
+          <w:rStyle w:val="VerbatimChar"/>
+        </w:rPr>
+        <w:t xml:space="preserve">/public/dpp/:token</w:t>
+      </w:r>
+      <w:r>
+        <w:t xml:space="preserve"> </w:t>
+      </w:r>
+      <w:r>
+        <w:t xml:space="preserve">oder</w:t>
+      </w:r>
+      <w:r>
+        <w:t xml:space="preserve"> </w:t>
+      </w:r>
+      <w:r>
+        <w:rPr>
+          <w:bCs/>
+          <w:b/>
+        </w:rPr>
+        <w:t xml:space="preserve">manuelle Token-Eingabe</w:t>
+      </w:r>
+      <w:r>
+        <w:t xml:space="preserve"> </w:t>
+      </w:r>
+      <w:r>
+        <w:t xml:space="preserve">auf</w:t>
+      </w:r>
+      <w:r>
+        <w:t xml:space="preserve"> </w:t>
+      </w:r>
+      <w:r>
+        <w:rPr>
+          <w:rStyle w:val="VerbatimChar"/>
+        </w:rPr>
+        <w:t xml:space="preserve">/lookup.html</w:t>
+      </w:r>
+      <w:r>
+        <w:t xml:space="preserve">.</w:t>
+      </w:r>
+    </w:p>
+    <w:bookmarkEnd w:id="39"/>
+    <w:bookmarkStart w:id="40" w:name="sprech-satz-1"/>
+    <w:p>
+      <w:pPr>
+        <w:pStyle w:val="Heading3"/>
+      </w:pPr>
+      <w:r>
+        <w:t xml:space="preserve">Sprech-Satz</w:t>
+      </w:r>
+    </w:p>
+    <w:p>
+      <w:pPr>
+        <w:pStyle w:val="BlockText"/>
+      </w:pPr>
+      <w:r>
+        <w:t xml:space="preserve">„Die Software-Architektur ist sechs Schichten von oben nach unten: Client, Platform boundary, API, Business Logic, Libs, Persistence.</w:t>
+      </w:r>
+      <w:r>
+        <w:t xml:space="preserve"> </w:t>
+      </w:r>
+      <w:r>
+        <w:rPr>
+          <w:bCs/>
+          <w:b/>
+        </w:rPr>
+        <w:t xml:space="preserve">CAP generiert</w:t>
+      </w:r>
+      <w:r>
+        <w:t xml:space="preserve"> </w:t>
+      </w:r>
+      <w:r>
+        <w:t xml:space="preserve">das CRUD und das Schema aus dem Modell; alles Fachliche — die Guards, der Lifecycle-Automat und die Aggregation (inkl. Per-Charge-Mittelung) — ist</w:t>
+      </w:r>
+      <w:r>
+        <w:t xml:space="preserve"> </w:t>
+      </w:r>
+      <w:r>
+        <w:rPr>
+          <w:bCs/>
+          <w:b/>
+        </w:rPr>
+        <w:t xml:space="preserve">selbst geschrieben</w:t>
+      </w:r>
+      <w:r>
+        <w:t xml:space="preserve">. Der Türsteher resolved Rolle und Mandant aus der DB und läuft vor jeder Logik."</w:t>
+      </w:r>
+    </w:p>
+    <w:p>
+      <w:r>
+        <w:pict>
+          <v:rect style="width:0;height:1.5pt" o:hralign="center" o:hrstd="t" o:hr="t"/>
+        </w:pict>
+      </w:r>
+    </w:p>
+    <w:bookmarkEnd w:id="40"/>
+    <w:bookmarkEnd w:id="41"/>
+    <w:bookmarkStart w:id="45" w:name="X627ff9e08bc8e9598734d3debeb2b51bf5aae69"/>
+    <w:p>
+      <w:pPr>
+        <w:pStyle w:val="Heading2"/>
+      </w:pPr>
+      <w:r>
+        <w:t xml:space="preserve">3. BTP-Architektur</w:t>
+      </w:r>
+    </w:p>
+    <w:p>
+      <w:pPr>
+        <w:pStyle w:val="FirstParagraph"/>
+      </w:pPr>
+      <w:r>
+        <w:rPr>
+          <w:iCs/>
+          <w:i/>
+        </w:rPr>
+        <w:t xml:space="preserve">Sicht: WO es läuft. Alles steckt im Subaccount (eu10-004) · CF Org · Space</w:t>
+      </w:r>
+      <w:r>
+        <w:rPr>
+          <w:iCs/>
+          <w:i/>
+        </w:rPr>
+        <w:t xml:space="preserve"> </w:t>
+      </w:r>
+      <w:r>
+        <w:rPr>
+          <w:rStyle w:val="VerbatimChar"/>
+          <w:iCs/>
+          <w:i/>
+        </w:rPr>
+        <w:t xml:space="preserve">dev</w:t>
+      </w:r>
+      <w:r>
+        <w:rPr>
+          <w:iCs/>
+          <w:i/>
+        </w:rPr>
+        <w:t xml:space="preserve">.</w:t>
+      </w:r>
+    </w:p>
+    <w:p>
+      <w:pPr>
+        <w:pStyle w:val="BodyText"/>
+      </w:pPr>
+      <w:r>
+        <w:t xml:space="preserve">Zentrale Unterscheidung:</w:t>
+      </w:r>
+      <w:r>
+        <w:t xml:space="preserve"> </w:t>
+      </w:r>
+      <w:r>
+        <w:rPr>
+          <w:bCs/>
+          <w:b/>
+        </w:rPr>
+        <w:t xml:space="preserve">Modul</w:t>
+      </w:r>
+      <w:r>
+        <w:t xml:space="preserve"> </w:t>
+      </w:r>
+      <w:r>
+        <w:t xml:space="preserve">= wird deployt und</w:t>
+      </w:r>
+      <w:r>
+        <w:t xml:space="preserve"> </w:t>
+      </w:r>
+      <w:r>
+        <w:rPr>
+          <w:iCs/>
+          <w:i/>
+        </w:rPr>
+        <w:t xml:space="preserve">läuft</w:t>
+      </w:r>
+      <w:r>
+        <w:t xml:space="preserve"> </w:t>
+      </w:r>
+      <w:r>
+        <w:t xml:space="preserve">·</w:t>
+      </w:r>
+      <w:r>
+        <w:t xml:space="preserve"> </w:t>
+      </w:r>
+      <w:r>
+        <w:rPr>
+          <w:bCs/>
+          <w:b/>
+        </w:rPr>
+        <w:t xml:space="preserve">Resource</w:t>
+      </w:r>
+      <w:r>
+        <w:t xml:space="preserve"> </w:t>
+      </w:r>
+      <w:r>
+        <w:t xml:space="preserve">= gebuchter Plattformdienst, an den Module per</w:t>
+      </w:r>
+      <w:r>
+        <w:t xml:space="preserve"> </w:t>
+      </w:r>
+      <w:r>
+        <w:rPr>
+          <w:iCs/>
+          <w:i/>
+        </w:rPr>
+        <w:t xml:space="preserve">Binding</w:t>
+      </w:r>
+      <w:r>
+        <w:t xml:space="preserve"> </w:t>
+      </w:r>
+      <w:r>
+        <w:t xml:space="preserve">andocken.</w:t>
+      </w:r>
+    </w:p>
+    <w:tbl>
+      <w:tblPr>
+        <w:tblStyle w:val="Table"/>
+        <w:tblW w:type="pct" w:w="0.0"/>
+        <w:tblLook w:firstRow="1" w:lastRow="0" w:firstColumn="0" w:lastColumn="0" w:noHBand="0" w:noVBand="0" w:val="0020"/>
+      </w:tblPr>
+      <w:tblGrid/>
+      <w:tr>
+        <w:tc>
+          <w:p>
+            <w:pPr>
+              <w:pStyle w:val="Compact"/>
+              <w:jc w:val="left"/>
+            </w:pPr>
+            <w:r>
+              <w:t xml:space="preserve">Rolle</w:t>
+            </w:r>
+          </w:p>
+        </w:tc>
+        <w:tc>
+          <w:p>
+            <w:pPr>
+              <w:pStyle w:val="Compact"/>
+              <w:jc w:val="left"/>
+            </w:pPr>
+            <w:r>
+              <w:t xml:space="preserve">Komponente</w:t>
+            </w:r>
+          </w:p>
+        </w:tc>
+        <w:tc>
+          <w:p>
+            <w:pPr>
+              <w:pStyle w:val="Compact"/>
+              <w:jc w:val="left"/>
+            </w:pPr>
+            <w:r>
+              <w:t xml:space="preserve">MTA-Typ</w:t>
+            </w:r>
+          </w:p>
+        </w:tc>
+        <w:tc>
+          <w:p>
+            <w:pPr>
+              <w:pStyle w:val="Compact"/>
+              <w:jc w:val="left"/>
+            </w:pPr>
+            <w:r>
+              <w:t xml:space="preserve">Backend/Frontend</w:t>
+            </w:r>
+          </w:p>
+        </w:tc>
+        <w:tc>
+          <w:p>
+            <w:pPr>
+              <w:pStyle w:val="Compact"/>
+              <w:jc w:val="left"/>
+            </w:pPr>
+            <w:r>
+              <w:t xml:space="preserve">Aufgabe</w:t>
+            </w:r>
+          </w:p>
+        </w:tc>
+      </w:tr>
+      <w:tr>
+        <w:tc>
+          <w:p>
+            <w:pPr>
+              <w:pStyle w:val="Compact"/>
+              <w:jc w:val="left"/>
+            </w:pPr>
+            <w:r>
+              <w:rPr>
+                <w:bCs/>
+                <w:b/>
+              </w:rPr>
+              <w:t xml:space="preserve">Einstieg / Routing</w:t>
+            </w:r>
+          </w:p>
+        </w:tc>
+        <w:tc>
+          <w:p>
+            <w:pPr>
+              <w:pStyle w:val="Compact"/>
+              <w:jc w:val="left"/>
+            </w:pPr>
+            <w:r>
+              <w:t xml:space="preserve">dpp-approuter</w:t>
+            </w:r>
+          </w:p>
+        </w:tc>
+        <w:tc>
+          <w:p>
+            <w:pPr>
+              <w:pStyle w:val="Compact"/>
+              <w:jc w:val="left"/>
+            </w:pPr>
+            <w:r>
+              <w:rPr>
+                <w:bCs/>
+                <w:b/>
+              </w:rPr>
+              <w:t xml:space="preserve">Modul</w:t>
+            </w:r>
+            <w:r>
+              <w:t xml:space="preserve"> </w:t>
+            </w:r>
+            <w:r>
+              <w:t xml:space="preserve">(</w:t>
+            </w:r>
+            <w:r>
+              <w:rPr>
+                <w:rStyle w:val="VerbatimChar"/>
+              </w:rPr>
+              <w:t xml:space="preserve">approuter.nodejs</w:t>
+            </w:r>
+            <w:r>
+              <w:t xml:space="preserve">)</w:t>
+            </w:r>
+          </w:p>
+        </w:tc>
+        <w:tc>
+          <w:p>
+            <w:pPr>
+              <w:pStyle w:val="Compact"/>
+              <w:jc w:val="left"/>
+            </w:pPr>
+            <w:r>
+              <w:t xml:space="preserve">Backend</w:t>
+            </w:r>
+          </w:p>
+        </w:tc>
+        <w:tc>
+          <w:p>
+            <w:pPr>
+              <w:pStyle w:val="Compact"/>
+              <w:jc w:val="left"/>
+            </w:pPr>
+            <w:r>
+              <w:t xml:space="preserve">öffentliche Tür, leitet API mit JWT weiter</w:t>
+            </w:r>
+          </w:p>
+        </w:tc>
+      </w:tr>
+      <w:tr>
+        <w:tc>
+          <w:p>
+            <w:pPr>
+              <w:pStyle w:val="Compact"/>
+              <w:jc w:val="left"/>
+            </w:pPr>
+            <w:r>
+              <w:rPr>
+                <w:bCs/>
+                <w:b/>
+              </w:rPr>
+              <w:t xml:space="preserve">App-Laufzeit</w:t>
+            </w:r>
+          </w:p>
+        </w:tc>
+        <w:tc>
+          <w:p>
+            <w:pPr>
+              <w:pStyle w:val="Compact"/>
+              <w:jc w:val="left"/>
+            </w:pPr>
+            <w:r>
+              <w:t xml:space="preserve">dpp-srv</w:t>
+            </w:r>
+          </w:p>
+        </w:tc>
+        <w:tc>
+          <w:p>
+            <w:pPr>
+              <w:pStyle w:val="Compact"/>
+              <w:jc w:val="left"/>
+            </w:pPr>
+            <w:r>
+              <w:rPr>
+                <w:bCs/>
+                <w:b/>
+              </w:rPr>
+              <w:t xml:space="preserve">Modul</w:t>
+            </w:r>
+            <w:r>
+              <w:t xml:space="preserve"> </w:t>
+            </w:r>
+            <w:r>
+              <w:t xml:space="preserve">(</w:t>
+            </w:r>
+            <w:r>
+              <w:rPr>
+                <w:rStyle w:val="VerbatimChar"/>
+              </w:rPr>
+              <w:t xml:space="preserve">nodejs</w:t>
+            </w:r>
+            <w:r>
+              <w:t xml:space="preserve">)</w:t>
+            </w:r>
+          </w:p>
+        </w:tc>
+        <w:tc>
+          <w:p>
+            <w:pPr>
+              <w:pStyle w:val="Compact"/>
+              <w:jc w:val="left"/>
+            </w:pPr>
+            <w:r>
+              <w:t xml:space="preserve">Backend</w:t>
+            </w:r>
+          </w:p>
+        </w:tc>
+        <w:tc>
+          <w:p>
+            <w:pPr>
+              <w:pStyle w:val="Compact"/>
+              <w:jc w:val="left"/>
+            </w:pPr>
+            <w:r>
+              <w:t xml:space="preserve">der laufende CAP-Service</w:t>
+            </w:r>
+          </w:p>
+        </w:tc>
+      </w:tr>
+      <w:tr>
+        <w:tc>
+          <w:p>
+            <w:pPr>
+              <w:pStyle w:val="Compact"/>
+              <w:jc w:val="left"/>
+            </w:pPr>
+            <w:r>
+              <w:rPr>
+                <w:bCs/>
+                <w:b/>
+              </w:rPr>
+              <w:t xml:space="preserve">Schema-Deploy</w:t>
+            </w:r>
+          </w:p>
+        </w:tc>
+        <w:tc>
+          <w:p>
+            <w:pPr>
+              <w:pStyle w:val="Compact"/>
+              <w:jc w:val="left"/>
+            </w:pPr>
+            <w:r>
+              <w:t xml:space="preserve">dpp-db-deployer</w:t>
+            </w:r>
+          </w:p>
+        </w:tc>
+        <w:tc>
+          <w:p>
+            <w:pPr>
+              <w:pStyle w:val="Compact"/>
+              <w:jc w:val="left"/>
+            </w:pPr>
+            <w:r>
+              <w:rPr>
+                <w:bCs/>
+                <w:b/>
+              </w:rPr>
+              <w:t xml:space="preserve">Modul</w:t>
+            </w:r>
+            <w:r>
+              <w:t xml:space="preserve"> </w:t>
+            </w:r>
+            <w:r>
+              <w:t xml:space="preserve">(</w:t>
+            </w:r>
+            <w:r>
+              <w:rPr>
+                <w:rStyle w:val="VerbatimChar"/>
+              </w:rPr>
+              <w:t xml:space="preserve">hdb</w:t>
+            </w:r>
+            <w:r>
+              <w:t xml:space="preserve">)</w:t>
+            </w:r>
+          </w:p>
+        </w:tc>
+        <w:tc>
+          <w:p>
+            <w:pPr>
+              <w:pStyle w:val="Compact"/>
+              <w:jc w:val="left"/>
+            </w:pPr>
+            <w:r>
+              <w:t xml:space="preserve">Backend</w:t>
+            </w:r>
+          </w:p>
+        </w:tc>
+        <w:tc>
+          <w:p>
+            <w:pPr>
+              <w:pStyle w:val="Compact"/>
+              <w:jc w:val="left"/>
+            </w:pPr>
+            <w:r>
+              <w:t xml:space="preserve">erzeugt das HANA-Schema, läuft einmal, beendet sich;</w:t>
+            </w:r>
+            <w:r>
+              <w:t xml:space="preserve"> </w:t>
+            </w:r>
+            <w:r>
+              <w:rPr>
+                <w:rStyle w:val="VerbatimChar"/>
+              </w:rPr>
+              <w:t xml:space="preserve">auto_undeploy</w:t>
+            </w:r>
+            <w:r>
+              <w:t xml:space="preserve"> </w:t>
+            </w:r>
+            <w:r>
+              <w:t xml:space="preserve">entfernt aus dem Modell entfernte Objekte</w:t>
+            </w:r>
+          </w:p>
+        </w:tc>
+      </w:tr>
+      <w:tr>
+        <w:tc>
+          <w:p>
+            <w:pPr>
+              <w:pStyle w:val="Compact"/>
+              <w:jc w:val="left"/>
+            </w:pPr>
+            <w:r>
+              <w:rPr>
+                <w:bCs/>
+                <w:b/>
+              </w:rPr>
+              <w:t xml:space="preserve">SPA-Auslieferung</w:t>
+            </w:r>
+          </w:p>
+        </w:tc>
+        <w:tc>
+          <w:p>
+            <w:pPr>
+              <w:pStyle w:val="Compact"/>
+              <w:jc w:val="left"/>
+            </w:pPr>
+            <w:r>
+              <w:t xml:space="preserve">dpp-frontend-approuter</w:t>
+            </w:r>
+          </w:p>
+        </w:tc>
+        <w:tc>
+          <w:p>
+            <w:pPr>
+              <w:pStyle w:val="Compact"/>
+              <w:jc w:val="left"/>
+            </w:pPr>
+            <w:r>
+              <w:rPr>
+                <w:bCs/>
+                <w:b/>
+              </w:rPr>
+              <w:t xml:space="preserve">Modul</w:t>
+            </w:r>
+            <w:r>
+              <w:t xml:space="preserve"> </w:t>
+            </w:r>
+            <w:r>
+              <w:t xml:space="preserve">(</w:t>
+            </w:r>
+            <w:r>
+              <w:rPr>
+                <w:rStyle w:val="VerbatimChar"/>
+              </w:rPr>
+              <w:t xml:space="preserve">approuter.nodejs</w:t>
+            </w:r>
+            <w:r>
+              <w:t xml:space="preserve">)</w:t>
+            </w:r>
+          </w:p>
+        </w:tc>
+        <w:tc>
+          <w:p>
+            <w:pPr>
+              <w:pStyle w:val="Compact"/>
+              <w:jc w:val="left"/>
+            </w:pPr>
+            <w:r>
+              <w:t xml:space="preserve">Frontend</w:t>
+            </w:r>
+          </w:p>
+        </w:tc>
+        <w:tc>
+          <w:p>
+            <w:pPr>
+              <w:pStyle w:val="Compact"/>
+              <w:jc w:val="left"/>
+            </w:pPr>
+            <w:r>
+              <w:t xml:space="preserve">serviert die 3 Entry-Points</w:t>
+            </w:r>
+            <w:r>
+              <w:t xml:space="preserve"> </w:t>
+            </w:r>
+            <w:r>
+              <w:rPr>
+                <w:bCs/>
+                <w:b/>
+              </w:rPr>
+              <w:t xml:space="preserve">aus localDir</w:t>
+            </w:r>
+            <w:r>
+              <w:t xml:space="preserve"> </w:t>
+            </w:r>
+            <w:r>
+              <w:t xml:space="preserve">(eigener Container);</w:t>
+            </w:r>
+            <w:r>
+              <w:t xml:space="preserve"> </w:t>
+            </w:r>
+            <w:r>
+              <w:rPr>
+                <w:rStyle w:val="VerbatimChar"/>
+              </w:rPr>
+              <w:t xml:space="preserve">consumer.html</w:t>
+            </w:r>
+            <w:r>
+              <w:t xml:space="preserve"> </w:t>
+            </w:r>
+            <w:r>
+              <w:t xml:space="preserve">+</w:t>
+            </w:r>
+            <w:r>
+              <w:t xml:space="preserve"> </w:t>
+            </w:r>
+            <w:r>
+              <w:rPr>
+                <w:rStyle w:val="VerbatimChar"/>
+              </w:rPr>
+              <w:t xml:space="preserve">lookup.html</w:t>
+            </w:r>
+            <w:r>
+              <w:t xml:space="preserve"> </w:t>
+            </w:r>
+            <w:r>
+              <w:t xml:space="preserve">öffentlich ohne Auth; zentraler Logout</w:t>
+            </w:r>
+            <w:r>
+              <w:t xml:space="preserve"> </w:t>
+            </w:r>
+            <w:r>
+              <w:rPr>
+                <w:rStyle w:val="VerbatimChar"/>
+              </w:rPr>
+              <w:t xml:space="preserve">/do/logout</w:t>
+            </w:r>
+            <w:r>
+              <w:t xml:space="preserve">; leitet</w:t>
+            </w:r>
+            <w:r>
+              <w:t xml:space="preserve"> </w:t>
+            </w:r>
+            <w:r>
+              <w:rPr>
+                <w:rStyle w:val="VerbatimChar"/>
+              </w:rPr>
+              <w:t xml:space="preserve">/odata</w:t>
+            </w:r>
+            <w:r>
+              <w:t xml:space="preserve">,</w:t>
+            </w:r>
+            <w:r>
+              <w:rPr>
+                <w:rStyle w:val="VerbatimChar"/>
+              </w:rPr>
+              <w:t xml:space="preserve">/public</w:t>
+            </w:r>
+            <w:r>
+              <w:t xml:space="preserve"> </w:t>
+            </w:r>
+            <w:r>
+              <w:t xml:space="preserve">weiter</w:t>
+            </w:r>
+          </w:p>
+        </w:tc>
+      </w:tr>
+      <w:tr>
+        <w:tc>
+          <w:p>
+            <w:pPr>
+              <w:pStyle w:val="Compact"/>
+              <w:jc w:val="left"/>
+            </w:pPr>
+            <w:r>
+              <w:rPr>
+                <w:bCs/>
+                <w:b/>
+              </w:rPr>
+              <w:t xml:space="preserve">UI-Build</w:t>
+            </w:r>
+          </w:p>
+        </w:tc>
+        <w:tc>
+          <w:p>
+            <w:pPr>
+              <w:pStyle w:val="Compact"/>
+              <w:jc w:val="left"/>
+            </w:pPr>
+            <w:r>
+              <w:t xml:space="preserve">dpp-ui</w:t>
+            </w:r>
+          </w:p>
+        </w:tc>
+        <w:tc>
+          <w:p>
+            <w:pPr>
+              <w:pStyle w:val="Compact"/>
+              <w:jc w:val="left"/>
+            </w:pPr>
+            <w:r>
+              <w:rPr>
+                <w:bCs/>
+                <w:b/>
+              </w:rPr>
+              <w:t xml:space="preserve">Modul</w:t>
+            </w:r>
+            <w:r>
+              <w:t xml:space="preserve"> </w:t>
+            </w:r>
+            <w:r>
+              <w:t xml:space="preserve">(</w:t>
+            </w:r>
+            <w:r>
+              <w:rPr>
+                <w:rStyle w:val="VerbatimChar"/>
+              </w:rPr>
+              <w:t xml:space="preserve">html5</w:t>
+            </w:r>
+            <w:r>
+              <w:t xml:space="preserve">)</w:t>
+            </w:r>
+          </w:p>
+        </w:tc>
+        <w:tc>
+          <w:p>
+            <w:pPr>
+              <w:pStyle w:val="Compact"/>
+              <w:jc w:val="left"/>
+            </w:pPr>
+            <w:r>
+              <w:t xml:space="preserve">Frontend</w:t>
+            </w:r>
+          </w:p>
+        </w:tc>
+        <w:tc>
+          <w:p>
+            <w:pPr>
+              <w:pStyle w:val="Compact"/>
+              <w:jc w:val="left"/>
+            </w:pPr>
+            <w:r>
+              <w:t xml:space="preserve">Vite-Build (3 Bundles: App, Consumer, Lookup) →</w:t>
+            </w:r>
+            <w:r>
+              <w:t xml:space="preserve"> </w:t>
+            </w:r>
+            <w:r>
+              <w:rPr>
+                <w:rStyle w:val="VerbatimChar"/>
+              </w:rPr>
+              <w:t xml:space="preserve">dist</w:t>
+            </w:r>
+            <w:r>
+              <w:t xml:space="preserve">;</w:t>
+            </w:r>
+            <w:r>
+              <w:t xml:space="preserve"> </w:t>
+            </w:r>
+            <w:r>
+              <w:rPr>
+                <w:rStyle w:val="VerbatimChar"/>
+              </w:rPr>
+              <w:t xml:space="preserve">dist</w:t>
+            </w:r>
+            <w:r>
+              <w:t xml:space="preserve"> </w:t>
+            </w:r>
+            <w:r>
+              <w:t xml:space="preserve">wird beim Build</w:t>
+            </w:r>
+            <w:r>
+              <w:t xml:space="preserve"> </w:t>
+            </w:r>
+            <w:r>
+              <w:rPr>
+                <w:bCs/>
+                <w:b/>
+              </w:rPr>
+              <w:t xml:space="preserve">in den Approuter kopiert</w:t>
+            </w:r>
+          </w:p>
+        </w:tc>
+      </w:tr>
+      <w:tr>
+        <w:tc>
+          <w:p>
+            <w:pPr>
+              <w:pStyle w:val="Compact"/>
+              <w:jc w:val="left"/>
+            </w:pPr>
+            <w:r>
+              <w:rPr>
+                <w:bCs/>
+                <w:b/>
+              </w:rPr>
+              <w:t xml:space="preserve">Datenbank</w:t>
+            </w:r>
+          </w:p>
+        </w:tc>
+        <w:tc>
+          <w:p>
+            <w:pPr>
+              <w:pStyle w:val="Compact"/>
+              <w:jc w:val="left"/>
+            </w:pPr>
+            <w:r>
+              <w:t xml:space="preserve">dpp-db</w:t>
+            </w:r>
+          </w:p>
+        </w:tc>
+        <w:tc>
+          <w:p>
+            <w:pPr>
+              <w:pStyle w:val="Compact"/>
+              <w:jc w:val="left"/>
+            </w:pPr>
+            <w:r>
+              <w:rPr>
+                <w:bCs/>
+                <w:b/>
+              </w:rPr>
+              <w:t xml:space="preserve">Resource</w:t>
+            </w:r>
+            <w:r>
+              <w:t xml:space="preserve"> </w:t>
+            </w:r>
+            <w:r>
+              <w:t xml:space="preserve">(HANA HDI,</w:t>
+            </w:r>
+            <w:r>
+              <w:t xml:space="preserve"> </w:t>
+            </w:r>
+            <w:r>
+              <w:rPr>
+                <w:rStyle w:val="VerbatimChar"/>
+              </w:rPr>
+              <w:t xml:space="preserve">hdi-shared</w:t>
+            </w:r>
+            <w:r>
+              <w:t xml:space="preserve">)</w:t>
+            </w:r>
+          </w:p>
+        </w:tc>
+        <w:tc>
+          <w:p>
+            <w:pPr>
+              <w:pStyle w:val="Compact"/>
+              <w:jc w:val="left"/>
+            </w:pPr>
+            <w:r>
+              <w:t xml:space="preserve">geteilt</w:t>
+            </w:r>
+          </w:p>
+        </w:tc>
+        <w:tc>
+          <w:p>
+            <w:pPr>
+              <w:pStyle w:val="Compact"/>
+              <w:jc w:val="left"/>
+            </w:pPr>
+            <w:r>
+              <w:t xml:space="preserve">speichert die 13 Tabellen</w:t>
+            </w:r>
+          </w:p>
+        </w:tc>
+      </w:tr>
+      <w:tr>
+        <w:tc>
+          <w:p>
+            <w:pPr>
+              <w:pStyle w:val="Compact"/>
+              <w:jc w:val="left"/>
+            </w:pPr>
+            <w:r>
+              <w:rPr>
+                <w:bCs/>
+                <w:b/>
+              </w:rPr>
+              <w:t xml:space="preserve">Identität</w:t>
+            </w:r>
+          </w:p>
+        </w:tc>
+        <w:tc>
+          <w:p>
+            <w:pPr>
+              <w:pStyle w:val="Compact"/>
+              <w:jc w:val="left"/>
+            </w:pPr>
+            <w:r>
+              <w:t xml:space="preserve">dpp-uaa</w:t>
+            </w:r>
+          </w:p>
+        </w:tc>
+        <w:tc>
+          <w:p>
+            <w:pPr>
+              <w:pStyle w:val="Compact"/>
+              <w:jc w:val="left"/>
+            </w:pPr>
+            <w:r>
+              <w:rPr>
+                <w:bCs/>
+                <w:b/>
+              </w:rPr>
+              <w:t xml:space="preserve">Resource</w:t>
+            </w:r>
+            <w:r>
+              <w:t xml:space="preserve"> </w:t>
+            </w:r>
+            <w:r>
+              <w:t xml:space="preserve">(XSUAA,</w:t>
+            </w:r>
+            <w:r>
+              <w:t xml:space="preserve"> </w:t>
+            </w:r>
+            <w:r>
+              <w:rPr>
+                <w:rStyle w:val="VerbatimChar"/>
+              </w:rPr>
+              <w:t xml:space="preserve">application</w:t>
+            </w:r>
+            <w:r>
+              <w:t xml:space="preserve">)</w:t>
+            </w:r>
+          </w:p>
+        </w:tc>
+        <w:tc>
+          <w:p>
+            <w:pPr>
+              <w:pStyle w:val="Compact"/>
+              <w:jc w:val="left"/>
+            </w:pPr>
+            <w:r>
+              <w:rPr>
+                <w:bCs/>
+                <w:b/>
+              </w:rPr>
+              <w:t xml:space="preserve">von beiden MTAs geteilt</w:t>
+            </w:r>
+          </w:p>
+        </w:tc>
+        <w:tc>
+          <w:p>
+            <w:pPr>
+              <w:pStyle w:val="Compact"/>
+              <w:jc w:val="left"/>
+            </w:pPr>
+            <w:r>
+              <w:t xml:space="preserve">stellt Tokens aus / prüft sie</w:t>
+            </w:r>
+          </w:p>
+        </w:tc>
+      </w:tr>
+      <w:tr>
+        <w:tc>
+          <w:p>
+            <w:pPr>
+              <w:pStyle w:val="Compact"/>
+              <w:jc w:val="left"/>
+            </w:pPr>
+            <w:r>
+              <w:rPr>
+                <w:bCs/>
+                <w:b/>
+              </w:rPr>
+              <w:t xml:space="preserve">Geheimnisse</w:t>
+            </w:r>
+          </w:p>
+        </w:tc>
+        <w:tc>
+          <w:p>
+            <w:pPr>
+              <w:pStyle w:val="Compact"/>
+              <w:jc w:val="left"/>
+            </w:pPr>
+            <w:r>
+              <w:t xml:space="preserve">dpp-secrets</w:t>
+            </w:r>
+          </w:p>
+        </w:tc>
+        <w:tc>
+          <w:p>
+            <w:pPr>
+              <w:pStyle w:val="Compact"/>
+              <w:jc w:val="left"/>
+            </w:pPr>
+            <w:r>
+              <w:rPr>
+                <w:bCs/>
+                <w:b/>
+              </w:rPr>
+              <w:t xml:space="preserve">Resource</w:t>
+            </w:r>
+            <w:r>
+              <w:t xml:space="preserve"> </w:t>
+            </w:r>
+            <w:r>
+              <w:t xml:space="preserve">(user-provided, vorab angelegt)</w:t>
+            </w:r>
+          </w:p>
+        </w:tc>
+        <w:tc>
+          <w:p>
+            <w:pPr>
+              <w:pStyle w:val="Compact"/>
+              <w:jc w:val="left"/>
+            </w:pPr>
+            <w:r>
+              <w:t xml:space="preserve">Backend</w:t>
+            </w:r>
+          </w:p>
+        </w:tc>
+        <w:tc>
+          <w:p>
+            <w:pPr>
+              <w:pStyle w:val="Compact"/>
+              <w:jc w:val="left"/>
+            </w:pPr>
+            <w:r>
+              <w:t xml:space="preserve">HMAC-Key + Public Base URL</w:t>
+            </w:r>
+          </w:p>
+        </w:tc>
+      </w:tr>
+    </w:tbl>
+    <w:bookmarkStart w:id="43" w:name="präzisierungen-2"/>
+    <w:p>
+      <w:pPr>
+        <w:pStyle w:val="Heading3"/>
+      </w:pPr>
+      <w:r>
+        <w:t xml:space="preserve">Präzisierungen</w:t>
+      </w:r>
+    </w:p>
+    <w:p>
+      <w:pPr>
+        <w:numPr>
+          <w:ilvl w:val="0"/>
+          <w:numId w:val="1004"/>
+        </w:numPr>
+        <w:pStyle w:val="Compact"/>
+      </w:pPr>
+      <w:r>
+        <w:rPr>
+          <w:bCs/>
+          <w:b/>
+        </w:rPr>
         <w:t xml:space="preserve">Binding = die Verbindung:</w:t>
       </w:r>
       <w:r>
@@ -4247,7 +5010,7 @@
       <w:r>
         <w:t xml:space="preserve"> </w:t>
       </w:r>
-      <w:hyperlink r:id="rId39">
+      <w:hyperlink r:id="rId42">
         <w:r>
           <w:rPr>
             <w:rStyle w:val="Hyperlink"/>
@@ -4259,14 +5022,51 @@
         <w:t xml:space="preserve"> </w:t>
       </w:r>
       <w:r>
-        <w:t xml:space="preserve">beim Boot.</w:t>
+        <w:t xml:space="preserve">beim Boot. Lokale</w:t>
+      </w:r>
+      <w:r>
+        <w:t xml:space="preserve"> </w:t>
+      </w:r>
+      <w:r>
+        <w:rPr>
+          <w:rStyle w:val="VerbatimChar"/>
+        </w:rPr>
+        <w:t xml:space="preserve">process.env</w:t>
+      </w:r>
+      <w:r>
+        <w:t xml:space="preserve">/</w:t>
+      </w:r>
+      <w:r>
+        <w:rPr>
+          <w:rStyle w:val="VerbatimChar"/>
+        </w:rPr>
+        <w:t xml:space="preserve">.env</w:t>
+      </w:r>
+      <w:r>
+        <w:t xml:space="preserve">-Werte haben Vorrang; VCAP füllt nur</w:t>
+      </w:r>
+      <w:r>
+        <w:t xml:space="preserve"> </w:t>
+      </w:r>
+      <w:r>
+        <w:rPr>
+          <w:bCs/>
+          <w:b/>
+        </w:rPr>
+        <w:t xml:space="preserve">fehlende</w:t>
+      </w:r>
+      <w:r>
+        <w:t xml:space="preserve"> </w:t>
+      </w:r>
+      <w:r>
+        <w:t xml:space="preserve">Keys.</w:t>
       </w:r>
     </w:p>
     <w:p>
       <w:pPr>
         <w:numPr>
           <w:ilvl w:val="0"/>
-          <w:numId w:val="1003"/>
+          <w:numId w:val="1004"/>
         </w:numPr>
         <w:pStyle w:val="Compact"/>
       </w:pPr>
@@ -4344,7 +5144,7 @@
       <w:pPr>
         <w:numPr>
           <w:ilvl w:val="0"/>
-          <w:numId w:val="1003"/>
+          <w:numId w:val="1004"/>
         </w:numPr>
         <w:pStyle w:val="Compact"/>
       </w:pPr>
@@ -4359,7 +5159,7 @@
         <w:t xml:space="preserve"> </w:t>
       </w:r>
       <w:r>
-        <w:t xml:space="preserve">jedes MTA hat seinen eigenen — Backend-Einstieg vs. Frontend-SPA-Auslieferung.</w:t>
+        <w:t xml:space="preserve">jedes MTA hat seinen eigenen — Backend-Einstieg vs. Frontend-SPA-Auslieferung.</w:t>
       </w:r>
       <w:r>
         <w:t xml:space="preserve"> </w:t>
@@ -4390,14 +5190,41 @@
         <w:t xml:space="preserve"> </w:t>
       </w:r>
       <w:r>
-        <w:t xml:space="preserve">weiter.</w:t>
+        <w:t xml:space="preserve">weiter (das Frontend über eine inline in</w:t>
+      </w:r>
+      <w:r>
+        <w:t xml:space="preserve"> </w:t>
+      </w:r>
+      <w:r>
+        <w:rPr>
+          <w:rStyle w:val="VerbatimChar"/>
+        </w:rPr>
+        <w:t xml:space="preserve">mta.yaml</w:t>
+      </w:r>
+      <w:r>
+        <w:t xml:space="preserve"> </w:t>
+      </w:r>
+      <w:r>
+        <w:t xml:space="preserve">gesetzte Destination, das Backend über</w:t>
+      </w:r>
+      <w:r>
+        <w:t xml:space="preserve"> </w:t>
+      </w:r>
+      <w:r>
+        <w:rPr>
+          <w:rStyle w:val="VerbatimChar"/>
+        </w:rPr>
+        <w:t xml:space="preserve">xs-app.json</w:t>
+      </w:r>
+      <w:r>
+        <w:t xml:space="preserve">).</w:t>
       </w:r>
     </w:p>
     <w:p>
       <w:pPr>
         <w:numPr>
           <w:ilvl w:val="0"/>
-          <w:numId w:val="1003"/>
+          <w:numId w:val="1004"/>
         </w:numPr>
         <w:pStyle w:val="Compact"/>
       </w:pPr>
@@ -4406,7 +5233,7 @@
           <w:bCs/>
           <w:b/>
         </w:rPr>
-        <w:t xml:space="preserve">Build vs. Deploy:</w:t>
+        <w:t xml:space="preserve">Build vs. Deploy:</w:t>
       </w:r>
       <w:r>
         <w:t xml:space="preserve"> </w:t>
@@ -4452,37 +5279,28 @@
       </w:r>
       <w:r>
         <w:t xml:space="preserve">legt die Resources an und startet die Module.</w:t>
-      </w:r>
-    </w:p>
-    <w:bookmarkEnd w:id="40"/>
-    <w:bookmarkStart w:id="41" w:name="sprech-satz-2"/>
-    <w:p>
-      <w:pPr>
-        <w:pStyle w:val="Heading3"/>
-      </w:pPr>
-      <w:r>
-        <w:t xml:space="preserve">Sprech-Satz</w:t>
       </w:r>
     </w:p>
     <w:p>
       <w:pPr>
-        <w:pStyle w:val="BlockText"/>
-      </w:pPr>
-      <w:r>
-        <w:t xml:space="preserve">„Auf BTP gibt es zwei Arten von Bausteinen:</w:t>
-      </w:r>
-      <w:r>
-        <w:t xml:space="preserve"> </w:t>
-      </w:r>
+        <w:numPr>
+          <w:ilvl w:val="0"/>
+          <w:numId w:val="1004"/>
+        </w:numPr>
+        <w:pStyle w:val="Compact"/>
+      </w:pPr>
       <w:r>
         <w:rPr>
           <w:bCs/>
           <w:b/>
         </w:rPr>
-        <w:t xml:space="preserve">Module</w:t>
-      </w:r>
-      <w:r>
-        <w:t xml:space="preserve">, die laufen — Approuter, der CAP-Service</w:t>
+        <w:t xml:space="preserve">Saubere Schema-Migrationen:</w:t>
+      </w:r>
+      <w:r>
+        <w:t xml:space="preserve"> </w:t>
+      </w:r>
+      <w:r>
+        <w:t xml:space="preserve">der DB-Deployer läuft mit</w:t>
       </w:r>
       <w:r>
         <w:t xml:space="preserve"> </w:t>
@@ -4491,13 +5309,31 @@
         <w:rPr>
           <w:rStyle w:val="VerbatimChar"/>
         </w:rPr>
-        <w:t xml:space="preserve">dpp-srv</w:t>
-      </w:r>
-      <w:r>
-        <w:t xml:space="preserve"> </w:t>
-      </w:r>
-      <w:r>
-        <w:t xml:space="preserve">und der DB-Deployer — und</w:t>
+        <w:t xml:space="preserve">HDI_DEPLOY_OPTIONS: auto_undeploy=true</w:t>
+      </w:r>
+      <w:r>
+        <w:t xml:space="preserve"> </w:t>
+      </w:r>
+      <w:r>
+        <w:t xml:space="preserve">— aus dem CDS-Modell entfernte HANA-Objekte (z. B. ein alter Unique-Index nach Modelländerung) werden im Container automatisch gedroppt, sodass Migrationen konfliktfrei durchlaufen.</w:t>
+      </w:r>
+    </w:p>
+    <w:bookmarkEnd w:id="43"/>
+    <w:bookmarkStart w:id="44" w:name="sprech-satz-2"/>
+    <w:p>
+      <w:pPr>
+        <w:pStyle w:val="Heading3"/>
+      </w:pPr>
+      <w:r>
+        <w:t xml:space="preserve">Sprech-Satz</w:t>
+      </w:r>
+    </w:p>
+    <w:p>
+      <w:pPr>
+        <w:pStyle w:val="BlockText"/>
+      </w:pPr>
+      <w:r>
+        <w:t xml:space="preserve">„Auf BTP gibt es zwei Arten von Bausteinen:</w:t>
       </w:r>
       <w:r>
         <w:t xml:space="preserve"> </w:t>
@@ -4507,10 +5343,38 @@
           <w:bCs/>
           <w:b/>
         </w:rPr>
+        <w:t xml:space="preserve">Module</w:t>
+      </w:r>
+      <w:r>
+        <w:t xml:space="preserve">, die laufen — Approuter, der CAP-Service</w:t>
+      </w:r>
+      <w:r>
+        <w:t xml:space="preserve"> </w:t>
+      </w:r>
+      <w:r>
+        <w:rPr>
+          <w:rStyle w:val="VerbatimChar"/>
+        </w:rPr>
+        <w:t xml:space="preserve">dpp-srv</w:t>
+      </w:r>
+      <w:r>
+        <w:t xml:space="preserve"> </w:t>
+      </w:r>
+      <w:r>
+        <w:t xml:space="preserve">und der DB-Deployer — und</w:t>
+      </w:r>
+      <w:r>
+        <w:t xml:space="preserve"> </w:t>
+      </w:r>
+      <w:r>
+        <w:rPr>
+          <w:bCs/>
+          <w:b/>
+        </w:rPr>
         <w:t xml:space="preserve">Resources</w:t>
       </w:r>
       <w:r>
-        <w:t xml:space="preserve">, also gebuchte Dienste: HANA als HDI-Container, XSUAA, die Runtime-Secrets und das HTML5-Repo. Module docken per</w:t>
+        <w:t xml:space="preserve">, also gebuchte Dienste: HANA als HDI-Container, XSUAA und die Runtime-Secrets. Module docken per</w:t>
       </w:r>
       <w:r>
         <w:t xml:space="preserve"> </w:t>
@@ -4549,9 +5413,9 @@
         </w:pict>
       </w:r>
     </w:p>
-    <w:bookmarkEnd w:id="41"/>
-    <w:bookmarkEnd w:id="42"/>
-    <w:bookmarkStart w:id="43" w:name="merksatz-für-die-abgrenzung"/>
+    <w:bookmarkEnd w:id="44"/>
+    <w:bookmarkEnd w:id="45"/>
+    <w:bookmarkStart w:id="46" w:name="merksatz-für-die-abgrenzung"/>
     <w:p>
       <w:pPr>
         <w:pStyle w:val="Heading2"/>
@@ -4613,8 +5477,8 @@
         <w:t xml:space="preserve">(Deployment). Dieselbe Anwendung, drei Sichten.</w:t>
       </w:r>
     </w:p>
-    <w:bookmarkEnd w:id="43"/>
-    <w:bookmarkEnd w:id="44"/>
+    <w:bookmarkEnd w:id="46"/>
+    <w:bookmarkEnd w:id="47"/>
     <w:sectPr/>
   </w:body>
 </w:document>
@@ -4721,8 +5585,84 @@
       </w:pPr>
     </w:lvl>
   </w:abstractNum>
+  <w:abstractNum w:abstractNumId="991">
+    <w:nsid w:val="ea454b4c"/>
+    <w:multiLevelType w:val="multilevel"/>
+    <w:lvl w:ilvl="0">
+      <w:numFmt w:val="bullet"/>
+      <w:lvlText w:val="•"/>
+      <w:lvlJc w:val="left"/>
+      <w:pPr>
+        <w:ind w:left="720" w:hanging="480"/>
+      </w:pPr>
+    </w:lvl>
+    <w:lvl w:ilvl="1">
+      <w:numFmt w:val="bullet"/>
+      <w:lvlText w:val="–"/>
+      <w:lvlJc w:val="left"/>
+      <w:pPr>
+        <w:ind w:left="1440" w:hanging="480"/>
+      </w:pPr>
+    </w:lvl>
+    <w:lvl w:ilvl="2">
+      <w:numFmt w:val="bullet"/>
+      <w:lvlText w:val="•"/>
+      <w:lvlJc w:val="left"/>
+      <w:pPr>
+        <w:ind w:left="2160" w:hanging="480"/>
+      </w:pPr>
+    </w:lvl>
+    <w:lvl w:ilvl="3">
+      <w:numFmt w:val="bullet"/>
+      <w:lvlText w:val="–"/>
+      <w:lvlJc w:val="left"/>
+      <w:pPr>
+        <w:ind w:left="2880" w:hanging="480"/>
+      </w:pPr>
+    </w:lvl>
+    <w:lvl w:ilvl="4">
+      <w:numFmt w:val="bullet"/>
+      <w:lvlText w:val="•"/>
+      <w:lvlJc w:val="left"/>
+      <w:pPr>
+        <w:ind w:left="3600" w:hanging="480"/>
+      </w:pPr>
+    </w:lvl>
+    <w:lvl w:ilvl="5">
+      <w:numFmt w:val="bullet"/>
+      <w:lvlText w:val="–"/>
+      <w:lvlJc w:val="left"/>
+      <w:pPr>
+        <w:ind w:left="4320" w:hanging="480"/>
+      </w:pPr>
+    </w:lvl>
+    <w:lvl w:ilvl="6">
+      <w:numFmt w:val="bullet"/>
+      <w:lvlText w:val="•"/>
+      <w:lvlJc w:val="left"/>
+      <w:pPr>
+        <w:ind w:left="5040" w:hanging="480"/>
+      </w:pPr>
+    </w:lvl>
+    <w:lvl w:ilvl="7">
+      <w:numFmt w:val="bullet"/>
+      <w:lvlText w:val="–"/>
+      <w:lvlJc w:val="left"/>
+      <w:pPr>
+        <w:ind w:left="5760" w:hanging="480"/>
+      </w:pPr>
+    </w:lvl>
+    <w:lvl w:ilvl="8">
+      <w:numFmt w:val="bullet"/>
+      <w:lvlText w:val="•"/>
+      <w:lvlJc w:val="left"/>
+      <w:pPr>
+        <w:ind w:left="6480" w:hanging="480"/>
+      </w:pPr>
+    </w:lvl>
+  </w:abstractNum>
   <w:abstractNum w:abstractNumId="99411">
-    <w:nsid w:val="ea454b4c"/>
+    <w:nsid w:val="71315dca"/>
     <w:multiLevelType w:val="multilevel"/>
     <w:lvl w:ilvl="0">
       <w:start w:val="1"/>
@@ -4810,34 +5750,7 @@
     <w:abstractNumId w:val="990"/>
   </w:num>
   <w:num w:numId="1001">
-    <w:abstractNumId w:val="99411"/>
-    <w:lvlOverride w:ilvl="0">
-      <w:startOverride w:val="1"/>
-    </w:lvlOverride>
-    <w:lvlOverride w:ilvl="1">
-      <w:startOverride w:val="1"/>
-    </w:lvlOverride>
-    <w:lvlOverride w:ilvl="2">
-      <w:startOverride w:val="1"/>
-    </w:lvlOverride>
-    <w:lvlOverride w:ilvl="3">
-      <w:startOverride w:val="1"/>
-    </w:lvlOverride>
-    <w:lvlOverride w:ilvl="4">
-      <w:startOverride w:val="1"/>
-    </w:lvlOverride>
-    <w:lvlOverride w:ilvl="5">
-      <w:startOverride w:val="1"/>
-    </w:lvlOverride>
-    <w:lvlOverride w:ilvl="6">
-      <w:startOverride w:val="1"/>
-    </w:lvlOverride>
-    <w:lvlOverride w:ilvl="7">
-      <w:startOverride w:val="1"/>
-    </w:lvlOverride>
-    <w:lvlOverride w:ilvl="8">
-      <w:startOverride w:val="1"/>
-    </w:lvlOverride>
+    <w:abstractNumId w:val="991"/>
   </w:num>
   <w:num w:numId="1002">
     <w:abstractNumId w:val="99411"/>
@@ -4870,6 +5783,36 @@
     </w:lvlOverride>
   </w:num>
   <w:num w:numId="1003">
+    <w:abstractNumId w:val="99411"/>
+    <w:lvlOverride w:ilvl="0">
+      <w:startOverride w:val="1"/>
+    </w:lvlOverride>
+    <w:lvlOverride w:ilvl="1">
+      <w:startOverride w:val="1"/>
+    </w:lvlOverride>
+    <w:lvlOverride w:ilvl="2">
+      <w:startOverride w:val="1"/>
+    </w:lvlOverride>
+    <w:lvlOverride w:ilvl="3">
+      <w:startOverride w:val="1"/>
+    </w:lvlOverride>
+    <w:lvlOverride w:ilvl="4">
+      <w:startOverride w:val="1"/>
+    </w:lvlOverride>
+    <w:lvlOverride w:ilvl="5">
+      <w:startOverride w:val="1"/>
+    </w:lvlOverride>
+    <w:lvlOverride w:ilvl="6">
+      <w:startOverride w:val="1"/>
+    </w:lvlOverride>
+    <w:lvlOverride w:ilvl="7">
+      <w:startOverride w:val="1"/>
+    </w:lvlOverride>
+    <w:lvlOverride w:ilvl="8">
+      <w:startOverride w:val="1"/>
+    </w:lvlOverride>
+  </w:num>
+  <w:num w:numId="1004">
     <w:abstractNumId w:val="99411"/>
     <w:lvlOverride w:ilvl="0">
       <w:startOverride w:val="1"/>

</xml_diff>